<commit_message>
Add Legal500 Canada and Caribbean configurations and templates
- Created legal500_canada.yaml and legal500_caribbean.yaml configuration files with required fields and copywriting guidelines.
- Added submission templates for Legal500 Canada and Caribbean in DOCX format.
- Updated strategy_selector.py to include paths for Canada and Caribbean configurations.
- Modified simulador_frontend.py to change the guide from Asia Pacific to Caribbean.
- Made minor adjustments to the existing US submission template.
</commit_message>
<xml_diff>
--- a/templates/legal500-us-submissions-template-2026-1-1-2.docx
+++ b/templates/legal500-us-submissions-template-2026-1-1-2.docx
@@ -216,7 +216,23 @@
                 <w:sz w:val="28"/>
                 <w:szCs w:val="28"/>
               </w:rPr>
-              <w:t>{{ Identity.firm_name }}</w:t>
+              <w:t xml:space="preserve">{{ </w:t>
+            </w:r>
+            <w:proofErr w:type="spellStart"/>
+            <w:r>
+              <w:rPr>
+                <w:sz w:val="28"/>
+                <w:szCs w:val="28"/>
+              </w:rPr>
+              <w:t>Identity.firm_name</w:t>
+            </w:r>
+            <w:proofErr w:type="spellEnd"/>
+            <w:r>
+              <w:rPr>
+                <w:sz w:val="28"/>
+                <w:szCs w:val="28"/>
+              </w:rPr>
+              <w:t xml:space="preserve"> }}</w:t>
             </w:r>
           </w:p>
         </w:tc>
@@ -263,7 +279,23 @@
                 <w:sz w:val="28"/>
                 <w:szCs w:val="28"/>
               </w:rPr>
-              <w:t>{{ Identity.country }}</w:t>
+              <w:t xml:space="preserve">{{ </w:t>
+            </w:r>
+            <w:proofErr w:type="spellStart"/>
+            <w:r>
+              <w:rPr>
+                <w:sz w:val="28"/>
+                <w:szCs w:val="28"/>
+              </w:rPr>
+              <w:t>Identity.country</w:t>
+            </w:r>
+            <w:proofErr w:type="spellEnd"/>
+            <w:r>
+              <w:rPr>
+                <w:sz w:val="28"/>
+                <w:szCs w:val="28"/>
+              </w:rPr>
+              <w:t xml:space="preserve"> }}</w:t>
             </w:r>
           </w:p>
         </w:tc>
@@ -543,7 +575,23 @@
                 <w:sz w:val="28"/>
                 <w:szCs w:val="28"/>
               </w:rPr>
-              <w:t>{{ Identity.practice_area }}</w:t>
+              <w:t xml:space="preserve">{{ </w:t>
+            </w:r>
+            <w:proofErr w:type="spellStart"/>
+            <w:r>
+              <w:rPr>
+                <w:sz w:val="28"/>
+                <w:szCs w:val="28"/>
+              </w:rPr>
+              <w:t>Identity.practice_area</w:t>
+            </w:r>
+            <w:proofErr w:type="spellEnd"/>
+            <w:r>
+              <w:rPr>
+                <w:sz w:val="28"/>
+                <w:szCs w:val="28"/>
+              </w:rPr>
+              <w:t xml:space="preserve"> }}</w:t>
             </w:r>
           </w:p>
         </w:tc>
@@ -817,6 +865,7 @@
               </w:rPr>
               <w:t xml:space="preserve">{{ </w:t>
             </w:r>
+            <w:proofErr w:type="spellStart"/>
             <w:r>
               <w:rPr>
                 <w:sz w:val="20"/>
@@ -851,7 +900,14 @@
               <w:rPr>
                 <w:sz w:val="20"/>
               </w:rPr>
-              <w:t>s[0]</w:t>
+              <w:t>s</w:t>
+            </w:r>
+            <w:proofErr w:type="spellEnd"/>
+            <w:r>
+              <w:rPr>
+                <w:sz w:val="20"/>
+              </w:rPr>
+              <w:t>[0]</w:t>
             </w:r>
             <w:r>
               <w:rPr>
@@ -872,6 +928,7 @@
                 <w:sz w:val="20"/>
               </w:rPr>
             </w:pPr>
+            <w:proofErr w:type="gramStart"/>
             <w:r>
               <w:rPr>
                 <w:sz w:val="20"/>
@@ -882,20 +939,49 @@
               <w:rPr>
                 <w:sz w:val="20"/>
               </w:rPr>
-              <w:t>Identity. i</w:t>
-            </w:r>
-            <w:r>
-              <w:rPr>
-                <w:sz w:val="20"/>
-              </w:rPr>
-              <w:t>nterview_contacts[0]</w:t>
-            </w:r>
-            <w:r>
-              <w:rPr>
-                <w:sz w:val="20"/>
-              </w:rPr>
-              <w:t>.job_title</w:t>
-            </w:r>
+              <w:t>Identity</w:t>
+            </w:r>
+            <w:proofErr w:type="gramEnd"/>
+            <w:r>
+              <w:rPr>
+                <w:sz w:val="20"/>
+              </w:rPr>
+              <w:t xml:space="preserve">. </w:t>
+            </w:r>
+            <w:proofErr w:type="spellStart"/>
+            <w:r>
+              <w:rPr>
+                <w:sz w:val="20"/>
+              </w:rPr>
+              <w:t>i</w:t>
+            </w:r>
+            <w:r>
+              <w:rPr>
+                <w:sz w:val="20"/>
+              </w:rPr>
+              <w:t>nterview_contacts</w:t>
+            </w:r>
+            <w:proofErr w:type="spellEnd"/>
+            <w:r>
+              <w:rPr>
+                <w:sz w:val="20"/>
+              </w:rPr>
+              <w:t>[0]</w:t>
+            </w:r>
+            <w:r>
+              <w:rPr>
+                <w:sz w:val="20"/>
+              </w:rPr>
+              <w:t>.</w:t>
+            </w:r>
+            <w:proofErr w:type="spellStart"/>
+            <w:r>
+              <w:rPr>
+                <w:sz w:val="20"/>
+              </w:rPr>
+              <w:t>job_title</w:t>
+            </w:r>
+            <w:proofErr w:type="spellEnd"/>
             <w:r>
               <w:rPr>
                 <w:sz w:val="20"/>
@@ -915,6 +1001,7 @@
                 <w:sz w:val="20"/>
               </w:rPr>
             </w:pPr>
+            <w:proofErr w:type="gramStart"/>
             <w:r>
               <w:rPr>
                 <w:sz w:val="20"/>
@@ -925,13 +1012,34 @@
               <w:rPr>
                 <w:sz w:val="20"/>
               </w:rPr>
-              <w:t>Identity. i</w:t>
-            </w:r>
-            <w:r>
-              <w:rPr>
-                <w:sz w:val="20"/>
-              </w:rPr>
-              <w:t>nterview_contacts[0]</w:t>
+              <w:t>Identity</w:t>
+            </w:r>
+            <w:proofErr w:type="gramEnd"/>
+            <w:r>
+              <w:rPr>
+                <w:sz w:val="20"/>
+              </w:rPr>
+              <w:t xml:space="preserve">. </w:t>
+            </w:r>
+            <w:proofErr w:type="spellStart"/>
+            <w:r>
+              <w:rPr>
+                <w:sz w:val="20"/>
+              </w:rPr>
+              <w:t>i</w:t>
+            </w:r>
+            <w:r>
+              <w:rPr>
+                <w:sz w:val="20"/>
+              </w:rPr>
+              <w:t>nterview_contacts</w:t>
+            </w:r>
+            <w:proofErr w:type="spellEnd"/>
+            <w:r>
+              <w:rPr>
+                <w:sz w:val="20"/>
+              </w:rPr>
+              <w:t>[0]</w:t>
             </w:r>
             <w:r>
               <w:rPr>
@@ -958,6 +1066,7 @@
                 <w:sz w:val="20"/>
               </w:rPr>
             </w:pPr>
+            <w:proofErr w:type="gramStart"/>
             <w:r>
               <w:rPr>
                 <w:sz w:val="20"/>
@@ -968,13 +1077,34 @@
               <w:rPr>
                 <w:sz w:val="20"/>
               </w:rPr>
-              <w:t>Identity. i</w:t>
-            </w:r>
-            <w:r>
-              <w:rPr>
-                <w:sz w:val="20"/>
-              </w:rPr>
-              <w:t>nterview_contacts[0]</w:t>
+              <w:t>Identity</w:t>
+            </w:r>
+            <w:proofErr w:type="gramEnd"/>
+            <w:r>
+              <w:rPr>
+                <w:sz w:val="20"/>
+              </w:rPr>
+              <w:t xml:space="preserve">. </w:t>
+            </w:r>
+            <w:proofErr w:type="spellStart"/>
+            <w:r>
+              <w:rPr>
+                <w:sz w:val="20"/>
+              </w:rPr>
+              <w:t>i</w:t>
+            </w:r>
+            <w:r>
+              <w:rPr>
+                <w:sz w:val="20"/>
+              </w:rPr>
+              <w:t>nterview_contacts</w:t>
+            </w:r>
+            <w:proofErr w:type="spellEnd"/>
+            <w:r>
+              <w:rPr>
+                <w:sz w:val="20"/>
+              </w:rPr>
+              <w:t>[0]</w:t>
             </w:r>
             <w:r>
               <w:rPr>
@@ -1006,6 +1136,7 @@
                 <w:sz w:val="20"/>
               </w:rPr>
             </w:pPr>
+            <w:proofErr w:type="gramStart"/>
             <w:r>
               <w:rPr>
                 <w:sz w:val="20"/>
@@ -1016,13 +1147,34 @@
               <w:rPr>
                 <w:sz w:val="20"/>
               </w:rPr>
-              <w:t>Identity. i</w:t>
-            </w:r>
-            <w:r>
-              <w:rPr>
-                <w:sz w:val="20"/>
-              </w:rPr>
-              <w:t>nterview_contacts[1]</w:t>
+              <w:t>Identity</w:t>
+            </w:r>
+            <w:proofErr w:type="gramEnd"/>
+            <w:r>
+              <w:rPr>
+                <w:sz w:val="20"/>
+              </w:rPr>
+              <w:t xml:space="preserve">. </w:t>
+            </w:r>
+            <w:proofErr w:type="spellStart"/>
+            <w:r>
+              <w:rPr>
+                <w:sz w:val="20"/>
+              </w:rPr>
+              <w:t>i</w:t>
+            </w:r>
+            <w:r>
+              <w:rPr>
+                <w:sz w:val="20"/>
+              </w:rPr>
+              <w:t>nterview_contacts</w:t>
+            </w:r>
+            <w:proofErr w:type="spellEnd"/>
+            <w:r>
+              <w:rPr>
+                <w:sz w:val="20"/>
+              </w:rPr>
+              <w:t>[1]</w:t>
             </w:r>
             <w:r>
               <w:rPr>
@@ -1043,6 +1195,7 @@
                 <w:sz w:val="20"/>
               </w:rPr>
             </w:pPr>
+            <w:proofErr w:type="gramStart"/>
             <w:r>
               <w:rPr>
                 <w:sz w:val="20"/>
@@ -1053,20 +1206,49 @@
               <w:rPr>
                 <w:sz w:val="20"/>
               </w:rPr>
-              <w:t>Identity. i</w:t>
-            </w:r>
-            <w:r>
-              <w:rPr>
-                <w:sz w:val="20"/>
-              </w:rPr>
-              <w:t>nterview_contacts[1]</w:t>
-            </w:r>
-            <w:r>
-              <w:rPr>
-                <w:sz w:val="20"/>
-              </w:rPr>
-              <w:t>.job_title</w:t>
-            </w:r>
+              <w:t>Identity</w:t>
+            </w:r>
+            <w:proofErr w:type="gramEnd"/>
+            <w:r>
+              <w:rPr>
+                <w:sz w:val="20"/>
+              </w:rPr>
+              <w:t xml:space="preserve">. </w:t>
+            </w:r>
+            <w:proofErr w:type="spellStart"/>
+            <w:r>
+              <w:rPr>
+                <w:sz w:val="20"/>
+              </w:rPr>
+              <w:t>i</w:t>
+            </w:r>
+            <w:r>
+              <w:rPr>
+                <w:sz w:val="20"/>
+              </w:rPr>
+              <w:t>nterview_contacts</w:t>
+            </w:r>
+            <w:proofErr w:type="spellEnd"/>
+            <w:r>
+              <w:rPr>
+                <w:sz w:val="20"/>
+              </w:rPr>
+              <w:t>[1]</w:t>
+            </w:r>
+            <w:r>
+              <w:rPr>
+                <w:sz w:val="20"/>
+              </w:rPr>
+              <w:t>.</w:t>
+            </w:r>
+            <w:proofErr w:type="spellStart"/>
+            <w:r>
+              <w:rPr>
+                <w:sz w:val="20"/>
+              </w:rPr>
+              <w:t>job_title</w:t>
+            </w:r>
+            <w:proofErr w:type="spellEnd"/>
             <w:r>
               <w:rPr>
                 <w:sz w:val="20"/>
@@ -1086,6 +1268,7 @@
                 <w:sz w:val="20"/>
               </w:rPr>
             </w:pPr>
+            <w:proofErr w:type="gramStart"/>
             <w:r>
               <w:rPr>
                 <w:sz w:val="20"/>
@@ -1096,13 +1279,34 @@
               <w:rPr>
                 <w:sz w:val="20"/>
               </w:rPr>
-              <w:t>Identity. i</w:t>
-            </w:r>
-            <w:r>
-              <w:rPr>
-                <w:sz w:val="20"/>
-              </w:rPr>
-              <w:t>nterview_contacts[1]</w:t>
+              <w:t>Identity</w:t>
+            </w:r>
+            <w:proofErr w:type="gramEnd"/>
+            <w:r>
+              <w:rPr>
+                <w:sz w:val="20"/>
+              </w:rPr>
+              <w:t xml:space="preserve">. </w:t>
+            </w:r>
+            <w:proofErr w:type="spellStart"/>
+            <w:r>
+              <w:rPr>
+                <w:sz w:val="20"/>
+              </w:rPr>
+              <w:t>i</w:t>
+            </w:r>
+            <w:r>
+              <w:rPr>
+                <w:sz w:val="20"/>
+              </w:rPr>
+              <w:t>nterview_contacts</w:t>
+            </w:r>
+            <w:proofErr w:type="spellEnd"/>
+            <w:r>
+              <w:rPr>
+                <w:sz w:val="20"/>
+              </w:rPr>
+              <w:t>[1]</w:t>
             </w:r>
             <w:r>
               <w:rPr>
@@ -1129,6 +1333,7 @@
                 <w:sz w:val="20"/>
               </w:rPr>
             </w:pPr>
+            <w:proofErr w:type="gramStart"/>
             <w:r>
               <w:rPr>
                 <w:sz w:val="20"/>
@@ -1139,13 +1344,34 @@
               <w:rPr>
                 <w:sz w:val="20"/>
               </w:rPr>
-              <w:t>Identity. i</w:t>
-            </w:r>
-            <w:r>
-              <w:rPr>
-                <w:sz w:val="20"/>
-              </w:rPr>
-              <w:t>nterview_contacts[1]</w:t>
+              <w:t>Identity</w:t>
+            </w:r>
+            <w:proofErr w:type="gramEnd"/>
+            <w:r>
+              <w:rPr>
+                <w:sz w:val="20"/>
+              </w:rPr>
+              <w:t xml:space="preserve">. </w:t>
+            </w:r>
+            <w:proofErr w:type="spellStart"/>
+            <w:r>
+              <w:rPr>
+                <w:sz w:val="20"/>
+              </w:rPr>
+              <w:t>i</w:t>
+            </w:r>
+            <w:r>
+              <w:rPr>
+                <w:sz w:val="20"/>
+              </w:rPr>
+              <w:t>nterview_contacts</w:t>
+            </w:r>
+            <w:proofErr w:type="spellEnd"/>
+            <w:r>
+              <w:rPr>
+                <w:sz w:val="20"/>
+              </w:rPr>
+              <w:t>[1]</w:t>
             </w:r>
             <w:r>
               <w:rPr>
@@ -1179,8 +1405,18 @@
           <w:sz w:val="28"/>
           <w:szCs w:val="28"/>
         </w:rPr>
-        <w:t>What is the Team or Department Name (as used by your firm)</w:t>
+        <w:t xml:space="preserve">What is the Team or Department Name (as used by your </w:t>
       </w:r>
+      <w:proofErr w:type="gramStart"/>
+      <w:r>
+        <w:rPr>
+          <w:b/>
+          <w:sz w:val="28"/>
+          <w:szCs w:val="28"/>
+        </w:rPr>
+        <w:t>firm)</w:t>
+      </w:r>
+      <w:proofErr w:type="gramEnd"/>
     </w:p>
     <w:tbl>
       <w:tblPr>
@@ -1210,7 +1446,21 @@
               <w:rPr>
                 <w:sz w:val="20"/>
               </w:rPr>
-              <w:t>{{DepartmentInfo.team_name_internal}}</w:t>
+              <w:t>{{</w:t>
+            </w:r>
+            <w:proofErr w:type="spellStart"/>
+            <w:r>
+              <w:rPr>
+                <w:sz w:val="20"/>
+              </w:rPr>
+              <w:t>DepartmentInfo.team_name_internal</w:t>
+            </w:r>
+            <w:proofErr w:type="spellEnd"/>
+            <w:r>
+              <w:rPr>
+                <w:sz w:val="20"/>
+              </w:rPr>
+              <w:t>}}</w:t>
             </w:r>
           </w:p>
         </w:tc>
@@ -1303,7 +1553,15 @@
               </w:rPr>
             </w:pPr>
             <w:r>
-              <w:t>{{ DepartmentInfo.heads_of_team[0].name }}</w:t>
+              <w:t xml:space="preserve">{{ </w:t>
+            </w:r>
+            <w:proofErr w:type="spellStart"/>
+            <w:r>
+              <w:t>DepartmentInfo.heads_of_team</w:t>
+            </w:r>
+            <w:proofErr w:type="spellEnd"/>
+            <w:r>
+              <w:t>[0].name }}</w:t>
             </w:r>
           </w:p>
         </w:tc>
@@ -1319,7 +1577,15 @@
               </w:rPr>
             </w:pPr>
             <w:r>
-              <w:t>{{ DepartmentInfo.heads_of_team[0].location }}</w:t>
+              <w:t xml:space="preserve">{{ </w:t>
+            </w:r>
+            <w:proofErr w:type="spellStart"/>
+            <w:r>
+              <w:t>DepartmentInfo.heads_of_team</w:t>
+            </w:r>
+            <w:proofErr w:type="spellEnd"/>
+            <w:r>
+              <w:t>[0].location }}</w:t>
             </w:r>
           </w:p>
         </w:tc>
@@ -1340,7 +1606,15 @@
               </w:rPr>
             </w:pPr>
             <w:r>
-              <w:t>{{ DepartmentInfo.heads_of_team[1].name }}</w:t>
+              <w:t xml:space="preserve">{{ </w:t>
+            </w:r>
+            <w:proofErr w:type="spellStart"/>
+            <w:r>
+              <w:t>DepartmentInfo.heads_of_team</w:t>
+            </w:r>
+            <w:proofErr w:type="spellEnd"/>
+            <w:r>
+              <w:t>[1].name }}</w:t>
             </w:r>
           </w:p>
         </w:tc>
@@ -1356,7 +1630,15 @@
               </w:rPr>
             </w:pPr>
             <w:r>
-              <w:t>{{ DepartmentInfo.heads_of_team[1].</w:t>
+              <w:t xml:space="preserve">{{ </w:t>
+            </w:r>
+            <w:proofErr w:type="spellStart"/>
+            <w:r>
+              <w:t>DepartmentInfo.heads_of_team</w:t>
+            </w:r>
+            <w:proofErr w:type="spellEnd"/>
+            <w:r>
+              <w:t>[1].</w:t>
             </w:r>
             <w:r>
               <w:t>location</w:t>
@@ -1383,7 +1665,15 @@
               </w:rPr>
             </w:pPr>
             <w:r>
-              <w:t>{{ DepartmentInfo.heads_of_team[2].name }}</w:t>
+              <w:t xml:space="preserve">{{ </w:t>
+            </w:r>
+            <w:proofErr w:type="spellStart"/>
+            <w:r>
+              <w:t>DepartmentInfo.heads_of_team</w:t>
+            </w:r>
+            <w:proofErr w:type="spellEnd"/>
+            <w:r>
+              <w:t>[2].name }}</w:t>
             </w:r>
           </w:p>
         </w:tc>
@@ -1399,7 +1689,15 @@
               </w:rPr>
             </w:pPr>
             <w:r>
-              <w:t>{{ DepartmentInfo.heads_of_team[2].location }}</w:t>
+              <w:t xml:space="preserve">{{ </w:t>
+            </w:r>
+            <w:proofErr w:type="spellStart"/>
+            <w:r>
+              <w:t>DepartmentInfo.heads_of_team</w:t>
+            </w:r>
+            <w:proofErr w:type="spellEnd"/>
+            <w:r>
+              <w:t>[2].location }}</w:t>
             </w:r>
           </w:p>
         </w:tc>
@@ -1416,8 +1714,8 @@
         <w:gridCol w:w="3822"/>
         <w:gridCol w:w="993"/>
         <w:gridCol w:w="283"/>
-        <w:gridCol w:w="3548"/>
-        <w:gridCol w:w="993"/>
+        <w:gridCol w:w="3539"/>
+        <w:gridCol w:w="1002"/>
       </w:tblGrid>
       <w:tr>
         <w:trPr>
@@ -1608,7 +1906,7 @@
         </w:tc>
         <w:tc>
           <w:tcPr>
-            <w:tcW w:w="3548" w:type="dxa"/>
+            <w:tcW w:w="3539" w:type="dxa"/>
             <w:tcBorders>
               <w:top w:val="single" w:sz="8" w:space="0" w:color="auto"/>
               <w:left w:val="single" w:sz="8" w:space="0" w:color="auto"/>
@@ -1681,7 +1979,7 @@
         </w:tc>
         <w:tc>
           <w:tcPr>
-            <w:tcW w:w="993" w:type="dxa"/>
+            <w:tcW w:w="1002" w:type="dxa"/>
             <w:tcBorders>
               <w:top w:val="single" w:sz="8" w:space="0" w:color="auto"/>
               <w:left w:val="nil"/>
@@ -1717,7 +2015,7 @@
                 <w:szCs w:val="20"/>
                 <w:lang w:eastAsia="en-GB"/>
               </w:rPr>
-              <w:t>{{Metrics.non_partners_count_50</w:t>
+              <w:t>{{Metrics.non_partners_count_50_p</w:t>
             </w:r>
             <w:r>
               <w:rPr>
@@ -1728,7 +2026,7 @@
                 <w:lang w:eastAsia="en-GB"/>
               </w:rPr>
               <w:lastRenderedPageBreak/>
-              <w:t>_percent_plus}}</w:t>
+              <w:t>ercent_plus}}</w:t>
             </w:r>
           </w:p>
         </w:tc>
@@ -1815,7 +2113,15 @@
               </w:rPr>
             </w:pPr>
             <w:r>
-              <w:t>{{Narratives.what_sets_us_apart}}</w:t>
+              <w:t>{{</w:t>
+            </w:r>
+            <w:proofErr w:type="spellStart"/>
+            <w:r>
+              <w:t>Narratives.what_sets_us_apart</w:t>
+            </w:r>
+            <w:proofErr w:type="spellEnd"/>
+            <w:r>
+              <w:t>}}</w:t>
             </w:r>
           </w:p>
         </w:tc>
@@ -1935,7 +2241,21 @@
               <w:rPr>
                 <w:rFonts w:asciiTheme="minorHAnsi" w:hAnsiTheme="minorHAnsi" w:cstheme="minorHAnsi"/>
               </w:rPr>
-              <w:t>{{Narratives.initiatives_and_innovation}}</w:t>
+              <w:t>{{</w:t>
+            </w:r>
+            <w:proofErr w:type="spellStart"/>
+            <w:r>
+              <w:rPr>
+                <w:rFonts w:asciiTheme="minorHAnsi" w:hAnsiTheme="minorHAnsi" w:cstheme="minorHAnsi"/>
+              </w:rPr>
+              <w:t>Narratives.initiatives_and_innovation</w:t>
+            </w:r>
+            <w:proofErr w:type="spellEnd"/>
+            <w:r>
+              <w:rPr>
+                <w:rFonts w:asciiTheme="minorHAnsi" w:hAnsiTheme="minorHAnsi" w:cstheme="minorHAnsi"/>
+              </w:rPr>
+              <w:t>}}</w:t>
             </w:r>
           </w:p>
         </w:tc>
@@ -2047,7 +2367,23 @@
                 <w:rFonts w:asciiTheme="minorHAnsi" w:hAnsiTheme="minorHAnsi" w:cstheme="minorHAnsi"/>
                 <w:iCs/>
               </w:rPr>
-              <w:t>{{Narratives.rankings_feedback}}</w:t>
+              <w:t>{{</w:t>
+            </w:r>
+            <w:proofErr w:type="spellStart"/>
+            <w:r>
+              <w:rPr>
+                <w:rFonts w:asciiTheme="minorHAnsi" w:hAnsiTheme="minorHAnsi" w:cstheme="minorHAnsi"/>
+                <w:iCs/>
+              </w:rPr>
+              <w:t>Narratives.rankings_feedback</w:t>
+            </w:r>
+            <w:proofErr w:type="spellEnd"/>
+            <w:r>
+              <w:rPr>
+                <w:rFonts w:asciiTheme="minorHAnsi" w:hAnsiTheme="minorHAnsi" w:cstheme="minorHAnsi"/>
+                <w:iCs/>
+              </w:rPr>
+              <w:t>}}</w:t>
             </w:r>
           </w:p>
         </w:tc>
@@ -2705,10 +3041,26 @@
               </w:rPr>
             </w:pPr>
             <w:r>
-              <w:t xml:space="preserve">{% for client in publishable_clients %} </w:t>
-            </w:r>
-            <w:r>
-              <w:t>{{ client.active_key_client }}</w:t>
+              <w:t xml:space="preserve">{% for client in </w:t>
+            </w:r>
+            <w:proofErr w:type="spellStart"/>
+            <w:r>
+              <w:t>publishable_clients</w:t>
+            </w:r>
+            <w:proofErr w:type="spellEnd"/>
+            <w:r>
+              <w:t xml:space="preserve"> %} </w:t>
+            </w:r>
+            <w:r>
+              <w:t xml:space="preserve">{{ </w:t>
+            </w:r>
+            <w:proofErr w:type="spellStart"/>
+            <w:r>
+              <w:t>client.active_key_client</w:t>
+            </w:r>
+            <w:proofErr w:type="spellEnd"/>
+            <w:r>
+              <w:t xml:space="preserve"> }}</w:t>
             </w:r>
             <w:r>
               <w:rPr>
@@ -2727,7 +3079,15 @@
           </w:tcPr>
           <w:p>
             <w:r>
-              <w:t>{{ client.is_new_client }}</w:t>
+              <w:t xml:space="preserve">{{ </w:t>
+            </w:r>
+            <w:proofErr w:type="spellStart"/>
+            <w:r>
+              <w:t>client.is_new_client</w:t>
+            </w:r>
+            <w:proofErr w:type="spellEnd"/>
+            <w:r>
+              <w:t xml:space="preserve"> }}</w:t>
             </w:r>
           </w:p>
         </w:tc>
@@ -2747,7 +3107,15 @@
               </w:rPr>
             </w:pPr>
             <w:r>
-              <w:t>{% endfor %}</w:t>
+              <w:t xml:space="preserve">{% </w:t>
+            </w:r>
+            <w:proofErr w:type="spellStart"/>
+            <w:r>
+              <w:t>endfor</w:t>
+            </w:r>
+            <w:proofErr w:type="spellEnd"/>
+            <w:r>
+              <w:t xml:space="preserve"> %}</w:t>
             </w:r>
           </w:p>
         </w:tc>
@@ -2901,13 +3269,26 @@
           </w:tcPr>
           <w:p>
             <w:r>
-              <w:t>{% for client in non_publishable_clients %}</w:t>
+              <w:t xml:space="preserve">{% for client in </w:t>
+            </w:r>
+            <w:proofErr w:type="spellStart"/>
+            <w:r>
+              <w:t>non_publishable_clients</w:t>
+            </w:r>
+            <w:proofErr w:type="spellEnd"/>
+            <w:r>
+              <w:t xml:space="preserve"> %}</w:t>
             </w:r>
             <w:r>
               <w:t xml:space="preserve">{{ </w:t>
             </w:r>
-            <w:r>
-              <w:t xml:space="preserve">client.active_key_client }} </w:t>
+            <w:proofErr w:type="spellStart"/>
+            <w:r>
+              <w:t>client.active_key_client</w:t>
+            </w:r>
+            <w:proofErr w:type="spellEnd"/>
+            <w:r>
+              <w:t xml:space="preserve"> }} </w:t>
             </w:r>
           </w:p>
         </w:tc>
@@ -2918,7 +3299,15 @@
           </w:tcPr>
           <w:p>
             <w:r>
-              <w:t>{{ client.is_new_client }}</w:t>
+              <w:t xml:space="preserve">{{ </w:t>
+            </w:r>
+            <w:proofErr w:type="spellStart"/>
+            <w:r>
+              <w:t>client.is_new_client</w:t>
+            </w:r>
+            <w:proofErr w:type="spellEnd"/>
+            <w:r>
+              <w:t xml:space="preserve"> }}</w:t>
             </w:r>
           </w:p>
         </w:tc>
@@ -2938,7 +3327,15 @@
               </w:rPr>
             </w:pPr>
             <w:r>
-              <w:t>{% endfor %}</w:t>
+              <w:t xml:space="preserve">{% </w:t>
+            </w:r>
+            <w:proofErr w:type="spellStart"/>
+            <w:r>
+              <w:t>endfor</w:t>
+            </w:r>
+            <w:proofErr w:type="spellEnd"/>
+            <w:r>
+              <w:t xml:space="preserve"> %}</w:t>
             </w:r>
           </w:p>
         </w:tc>
@@ -3386,7 +3783,23 @@
                 <w:sz w:val="20"/>
                 <w:szCs w:val="20"/>
               </w:rPr>
-              <w:t xml:space="preserve">{{ individual_nominations.leading_partners[0].name }} </w:t>
+              <w:t xml:space="preserve">{{ </w:t>
+            </w:r>
+            <w:proofErr w:type="spellStart"/>
+            <w:r>
+              <w:rPr>
+                <w:sz w:val="20"/>
+                <w:szCs w:val="20"/>
+              </w:rPr>
+              <w:t>individual_nominations.leading_partners</w:t>
+            </w:r>
+            <w:proofErr w:type="spellEnd"/>
+            <w:r>
+              <w:rPr>
+                <w:sz w:val="20"/>
+                <w:szCs w:val="20"/>
+              </w:rPr>
+              <w:t xml:space="preserve">[0].name }} </w:t>
             </w:r>
           </w:p>
         </w:tc>
@@ -3406,7 +3819,23 @@
                 <w:sz w:val="20"/>
                 <w:szCs w:val="20"/>
               </w:rPr>
-              <w:t>{{ individual_nominations.leading_partners[0].location }}</w:t>
+              <w:t xml:space="preserve">{{ </w:t>
+            </w:r>
+            <w:proofErr w:type="spellStart"/>
+            <w:r>
+              <w:rPr>
+                <w:sz w:val="20"/>
+                <w:szCs w:val="20"/>
+              </w:rPr>
+              <w:t>individual_nominations.leading_partners</w:t>
+            </w:r>
+            <w:proofErr w:type="spellEnd"/>
+            <w:r>
+              <w:rPr>
+                <w:sz w:val="20"/>
+                <w:szCs w:val="20"/>
+              </w:rPr>
+              <w:t>[0].location }}</w:t>
             </w:r>
           </w:p>
         </w:tc>
@@ -3719,14 +4148,30 @@
                 <w:sz w:val="20"/>
                 <w:szCs w:val="20"/>
               </w:rPr>
-              <w:t>{{ individua</w:t>
-            </w:r>
-            <w:r>
-              <w:rPr>
-                <w:sz w:val="20"/>
-                <w:szCs w:val="20"/>
-              </w:rPr>
-              <w:t>l_nominations.leading_partners[1</w:t>
+              <w:t xml:space="preserve">{{ </w:t>
+            </w:r>
+            <w:proofErr w:type="spellStart"/>
+            <w:r>
+              <w:rPr>
+                <w:sz w:val="20"/>
+                <w:szCs w:val="20"/>
+              </w:rPr>
+              <w:t>individua</w:t>
+            </w:r>
+            <w:r>
+              <w:rPr>
+                <w:sz w:val="20"/>
+                <w:szCs w:val="20"/>
+              </w:rPr>
+              <w:t>l_nominations.leading_partners</w:t>
+            </w:r>
+            <w:proofErr w:type="spellEnd"/>
+            <w:r>
+              <w:rPr>
+                <w:sz w:val="20"/>
+                <w:szCs w:val="20"/>
+              </w:rPr>
+              <w:t>[1</w:t>
             </w:r>
             <w:r>
               <w:rPr>
@@ -3757,14 +4202,30 @@
                 <w:sz w:val="20"/>
                 <w:szCs w:val="20"/>
               </w:rPr>
-              <w:t>{{ individua</w:t>
-            </w:r>
-            <w:r>
-              <w:rPr>
-                <w:sz w:val="20"/>
-                <w:szCs w:val="20"/>
-              </w:rPr>
-              <w:t>l_nominations.leading_partners[1</w:t>
+              <w:t xml:space="preserve">{{ </w:t>
+            </w:r>
+            <w:proofErr w:type="spellStart"/>
+            <w:r>
+              <w:rPr>
+                <w:sz w:val="20"/>
+                <w:szCs w:val="20"/>
+              </w:rPr>
+              <w:t>individua</w:t>
+            </w:r>
+            <w:r>
+              <w:rPr>
+                <w:sz w:val="20"/>
+                <w:szCs w:val="20"/>
+              </w:rPr>
+              <w:t>l_nominations.leading_partners</w:t>
+            </w:r>
+            <w:proofErr w:type="spellEnd"/>
+            <w:r>
+              <w:rPr>
+                <w:sz w:val="20"/>
+                <w:szCs w:val="20"/>
+              </w:rPr>
+              <w:t>[1</w:t>
             </w:r>
             <w:r>
               <w:rPr>
@@ -4069,14 +4530,30 @@
                 <w:sz w:val="20"/>
                 <w:szCs w:val="20"/>
               </w:rPr>
-              <w:t>{{ individua</w:t>
-            </w:r>
-            <w:r>
-              <w:rPr>
-                <w:sz w:val="20"/>
-                <w:szCs w:val="20"/>
-              </w:rPr>
-              <w:t>l_nominations.leading_partners[2</w:t>
+              <w:t xml:space="preserve">{{ </w:t>
+            </w:r>
+            <w:proofErr w:type="spellStart"/>
+            <w:r>
+              <w:rPr>
+                <w:sz w:val="20"/>
+                <w:szCs w:val="20"/>
+              </w:rPr>
+              <w:t>individua</w:t>
+            </w:r>
+            <w:r>
+              <w:rPr>
+                <w:sz w:val="20"/>
+                <w:szCs w:val="20"/>
+              </w:rPr>
+              <w:t>l_nominations.leading_partners</w:t>
+            </w:r>
+            <w:proofErr w:type="spellEnd"/>
+            <w:r>
+              <w:rPr>
+                <w:sz w:val="20"/>
+                <w:szCs w:val="20"/>
+              </w:rPr>
+              <w:t>[2</w:t>
             </w:r>
             <w:r>
               <w:rPr>
@@ -4103,14 +4580,30 @@
                 <w:sz w:val="20"/>
                 <w:szCs w:val="20"/>
               </w:rPr>
-              <w:t>{{ individua</w:t>
-            </w:r>
-            <w:r>
-              <w:rPr>
-                <w:sz w:val="20"/>
-                <w:szCs w:val="20"/>
-              </w:rPr>
-              <w:t>l_nominations.leading_partners[2</w:t>
+              <w:t xml:space="preserve">{{ </w:t>
+            </w:r>
+            <w:proofErr w:type="spellStart"/>
+            <w:r>
+              <w:rPr>
+                <w:sz w:val="20"/>
+                <w:szCs w:val="20"/>
+              </w:rPr>
+              <w:t>individua</w:t>
+            </w:r>
+            <w:r>
+              <w:rPr>
+                <w:sz w:val="20"/>
+                <w:szCs w:val="20"/>
+              </w:rPr>
+              <w:t>l_nominations.leading_partners</w:t>
+            </w:r>
+            <w:proofErr w:type="spellEnd"/>
+            <w:r>
+              <w:rPr>
+                <w:sz w:val="20"/>
+                <w:szCs w:val="20"/>
+              </w:rPr>
+              <w:t>[2</w:t>
             </w:r>
             <w:r>
               <w:rPr>
@@ -4515,14 +5008,30 @@
                 <w:sz w:val="20"/>
                 <w:szCs w:val="20"/>
               </w:rPr>
-              <w:t>{{ individua</w:t>
-            </w:r>
-            <w:r>
-              <w:rPr>
-                <w:sz w:val="20"/>
-                <w:szCs w:val="20"/>
-              </w:rPr>
-              <w:t>l_nominations.next_generation_partners[0</w:t>
+              <w:t xml:space="preserve">{{ </w:t>
+            </w:r>
+            <w:proofErr w:type="spellStart"/>
+            <w:r>
+              <w:rPr>
+                <w:sz w:val="20"/>
+                <w:szCs w:val="20"/>
+              </w:rPr>
+              <w:t>individua</w:t>
+            </w:r>
+            <w:r>
+              <w:rPr>
+                <w:sz w:val="20"/>
+                <w:szCs w:val="20"/>
+              </w:rPr>
+              <w:t>l_nominations.next_generation_partners</w:t>
+            </w:r>
+            <w:proofErr w:type="spellEnd"/>
+            <w:r>
+              <w:rPr>
+                <w:sz w:val="20"/>
+                <w:szCs w:val="20"/>
+              </w:rPr>
+              <w:t>[0</w:t>
             </w:r>
             <w:r>
               <w:rPr>
@@ -4549,14 +5058,30 @@
                 <w:sz w:val="20"/>
                 <w:szCs w:val="20"/>
               </w:rPr>
-              <w:t>{{ individua</w:t>
-            </w:r>
-            <w:r>
-              <w:rPr>
-                <w:sz w:val="20"/>
-                <w:szCs w:val="20"/>
-              </w:rPr>
-              <w:t>l_nominations.next_generation_partners[0].location</w:t>
+              <w:t xml:space="preserve">{{ </w:t>
+            </w:r>
+            <w:proofErr w:type="spellStart"/>
+            <w:r>
+              <w:rPr>
+                <w:sz w:val="20"/>
+                <w:szCs w:val="20"/>
+              </w:rPr>
+              <w:t>individua</w:t>
+            </w:r>
+            <w:r>
+              <w:rPr>
+                <w:sz w:val="20"/>
+                <w:szCs w:val="20"/>
+              </w:rPr>
+              <w:t>l_nominations.next_generation_partners</w:t>
+            </w:r>
+            <w:proofErr w:type="spellEnd"/>
+            <w:r>
+              <w:rPr>
+                <w:sz w:val="20"/>
+                <w:szCs w:val="20"/>
+              </w:rPr>
+              <w:t>[0].location</w:t>
             </w:r>
             <w:r>
               <w:rPr>
@@ -4762,14 +5287,30 @@
                 <w:sz w:val="20"/>
                 <w:szCs w:val="20"/>
               </w:rPr>
-              <w:t>{{ individua</w:t>
-            </w:r>
-            <w:r>
-              <w:rPr>
-                <w:sz w:val="20"/>
-                <w:szCs w:val="20"/>
-              </w:rPr>
-              <w:t>l_nominations.next_generation_partners[1</w:t>
+              <w:t xml:space="preserve">{{ </w:t>
+            </w:r>
+            <w:proofErr w:type="spellStart"/>
+            <w:r>
+              <w:rPr>
+                <w:sz w:val="20"/>
+                <w:szCs w:val="20"/>
+              </w:rPr>
+              <w:t>individua</w:t>
+            </w:r>
+            <w:r>
+              <w:rPr>
+                <w:sz w:val="20"/>
+                <w:szCs w:val="20"/>
+              </w:rPr>
+              <w:t>l_nominations.next_generation_partners</w:t>
+            </w:r>
+            <w:proofErr w:type="spellEnd"/>
+            <w:r>
+              <w:rPr>
+                <w:sz w:val="20"/>
+                <w:szCs w:val="20"/>
+              </w:rPr>
+              <w:t>[1</w:t>
             </w:r>
             <w:r>
               <w:rPr>
@@ -4796,14 +5337,30 @@
                 <w:sz w:val="20"/>
                 <w:szCs w:val="20"/>
               </w:rPr>
-              <w:t>{{ individua</w:t>
-            </w:r>
-            <w:r>
-              <w:rPr>
-                <w:sz w:val="20"/>
-                <w:szCs w:val="20"/>
-              </w:rPr>
-              <w:t>l_nominations.next_generation_partners[1].location</w:t>
+              <w:t xml:space="preserve">{{ </w:t>
+            </w:r>
+            <w:proofErr w:type="spellStart"/>
+            <w:r>
+              <w:rPr>
+                <w:sz w:val="20"/>
+                <w:szCs w:val="20"/>
+              </w:rPr>
+              <w:t>individua</w:t>
+            </w:r>
+            <w:r>
+              <w:rPr>
+                <w:sz w:val="20"/>
+                <w:szCs w:val="20"/>
+              </w:rPr>
+              <w:t>l_nominations.next_generation_partners</w:t>
+            </w:r>
+            <w:proofErr w:type="spellEnd"/>
+            <w:r>
+              <w:rPr>
+                <w:sz w:val="20"/>
+                <w:szCs w:val="20"/>
+              </w:rPr>
+              <w:t>[1].location</w:t>
             </w:r>
             <w:r>
               <w:rPr>
@@ -5185,14 +5742,30 @@
                 <w:sz w:val="20"/>
                 <w:szCs w:val="20"/>
               </w:rPr>
-              <w:t>{{ individua</w:t>
-            </w:r>
-            <w:r>
-              <w:rPr>
-                <w:sz w:val="20"/>
-                <w:szCs w:val="20"/>
-              </w:rPr>
-              <w:t>l_nominations.leading_associates[0</w:t>
+              <w:t xml:space="preserve">{{ </w:t>
+            </w:r>
+            <w:proofErr w:type="spellStart"/>
+            <w:r>
+              <w:rPr>
+                <w:sz w:val="20"/>
+                <w:szCs w:val="20"/>
+              </w:rPr>
+              <w:t>individua</w:t>
+            </w:r>
+            <w:r>
+              <w:rPr>
+                <w:sz w:val="20"/>
+                <w:szCs w:val="20"/>
+              </w:rPr>
+              <w:t>l_nominations.leading_associates</w:t>
+            </w:r>
+            <w:proofErr w:type="spellEnd"/>
+            <w:r>
+              <w:rPr>
+                <w:sz w:val="20"/>
+                <w:szCs w:val="20"/>
+              </w:rPr>
+              <w:t>[0</w:t>
             </w:r>
             <w:r>
               <w:rPr>
@@ -5219,14 +5792,30 @@
                 <w:sz w:val="20"/>
                 <w:szCs w:val="20"/>
               </w:rPr>
-              <w:t>{{ individua</w:t>
-            </w:r>
-            <w:r>
-              <w:rPr>
-                <w:sz w:val="20"/>
-                <w:szCs w:val="20"/>
-              </w:rPr>
-              <w:t>l_nominations.leading_associates[0].location</w:t>
+              <w:t xml:space="preserve">{{ </w:t>
+            </w:r>
+            <w:proofErr w:type="spellStart"/>
+            <w:r>
+              <w:rPr>
+                <w:sz w:val="20"/>
+                <w:szCs w:val="20"/>
+              </w:rPr>
+              <w:t>individua</w:t>
+            </w:r>
+            <w:r>
+              <w:rPr>
+                <w:sz w:val="20"/>
+                <w:szCs w:val="20"/>
+              </w:rPr>
+              <w:t>l_nominations.leading_associates</w:t>
+            </w:r>
+            <w:proofErr w:type="spellEnd"/>
+            <w:r>
+              <w:rPr>
+                <w:sz w:val="20"/>
+                <w:szCs w:val="20"/>
+              </w:rPr>
+              <w:t>[0].location</w:t>
             </w:r>
             <w:r>
               <w:rPr>
@@ -5433,14 +6022,30 @@
                 <w:sz w:val="20"/>
                 <w:szCs w:val="20"/>
               </w:rPr>
-              <w:t>{{ individua</w:t>
-            </w:r>
-            <w:r>
-              <w:rPr>
-                <w:sz w:val="20"/>
-                <w:szCs w:val="20"/>
-              </w:rPr>
-              <w:t>l_nominations.leading_associates[1</w:t>
+              <w:t xml:space="preserve">{{ </w:t>
+            </w:r>
+            <w:proofErr w:type="spellStart"/>
+            <w:r>
+              <w:rPr>
+                <w:sz w:val="20"/>
+                <w:szCs w:val="20"/>
+              </w:rPr>
+              <w:t>individua</w:t>
+            </w:r>
+            <w:r>
+              <w:rPr>
+                <w:sz w:val="20"/>
+                <w:szCs w:val="20"/>
+              </w:rPr>
+              <w:t>l_nominations.leading_associates</w:t>
+            </w:r>
+            <w:proofErr w:type="spellEnd"/>
+            <w:r>
+              <w:rPr>
+                <w:sz w:val="20"/>
+                <w:szCs w:val="20"/>
+              </w:rPr>
+              <w:t>[1</w:t>
             </w:r>
             <w:r>
               <w:rPr>
@@ -5467,14 +6072,30 @@
                 <w:sz w:val="20"/>
                 <w:szCs w:val="20"/>
               </w:rPr>
-              <w:t>{{ individua</w:t>
-            </w:r>
-            <w:r>
-              <w:rPr>
-                <w:sz w:val="20"/>
-                <w:szCs w:val="20"/>
-              </w:rPr>
-              <w:t>l_nominations.leading_associates[1].location</w:t>
+              <w:t xml:space="preserve">{{ </w:t>
+            </w:r>
+            <w:proofErr w:type="spellStart"/>
+            <w:r>
+              <w:rPr>
+                <w:sz w:val="20"/>
+                <w:szCs w:val="20"/>
+              </w:rPr>
+              <w:t>individua</w:t>
+            </w:r>
+            <w:r>
+              <w:rPr>
+                <w:sz w:val="20"/>
+                <w:szCs w:val="20"/>
+              </w:rPr>
+              <w:t>l_nominations.leading_associates</w:t>
+            </w:r>
+            <w:proofErr w:type="spellEnd"/>
+            <w:r>
+              <w:rPr>
+                <w:sz w:val="20"/>
+                <w:szCs w:val="20"/>
+              </w:rPr>
+              <w:t>[1].location</w:t>
             </w:r>
             <w:r>
               <w:rPr>
@@ -5757,7 +6378,15 @@
           </w:tcPr>
           <w:p>
             <w:r>
-              <w:t>{% for team in ArrivalDeparture %}</w:t>
+              <w:t xml:space="preserve">{% for team in </w:t>
+            </w:r>
+            <w:proofErr w:type="spellStart"/>
+            <w:r>
+              <w:t>ArrivalDeparture</w:t>
+            </w:r>
+            <w:proofErr w:type="spellEnd"/>
+            <w:r>
+              <w:t xml:space="preserve"> %}</w:t>
             </w:r>
             <w:r>
               <w:t>{{ team.name}}</w:t>
@@ -5770,7 +6399,15 @@
           </w:tcPr>
           <w:p>
             <w:r>
-              <w:t>{{ team.position_role}}</w:t>
+              <w:t xml:space="preserve">{{ </w:t>
+            </w:r>
+            <w:proofErr w:type="spellStart"/>
+            <w:r>
+              <w:t>team.position_role</w:t>
+            </w:r>
+            <w:proofErr w:type="spellEnd"/>
+            <w:r>
+              <w:t>}}</w:t>
             </w:r>
           </w:p>
         </w:tc>
@@ -5780,7 +6417,15 @@
           </w:tcPr>
           <w:p>
             <w:r>
-              <w:t>{{ team.action}}</w:t>
+              <w:t xml:space="preserve">{{ </w:t>
+            </w:r>
+            <w:proofErr w:type="spellStart"/>
+            <w:r>
+              <w:t>team.action</w:t>
+            </w:r>
+            <w:proofErr w:type="spellEnd"/>
+            <w:r>
+              <w:t>}}</w:t>
             </w:r>
           </w:p>
         </w:tc>
@@ -5790,7 +6435,15 @@
           </w:tcPr>
           <w:p>
             <w:r>
-              <w:t>{{ team.firm_source_destination}}</w:t>
+              <w:t xml:space="preserve">{{ </w:t>
+            </w:r>
+            <w:proofErr w:type="spellStart"/>
+            <w:r>
+              <w:t>team.firm_source_destination</w:t>
+            </w:r>
+            <w:proofErr w:type="spellEnd"/>
+            <w:r>
+              <w:t>}}</w:t>
             </w:r>
           </w:p>
         </w:tc>
@@ -5800,7 +6453,15 @@
           </w:tcPr>
           <w:p>
             <w:r>
-              <w:t>{{ team.month_year}}</w:t>
+              <w:t xml:space="preserve">{{ </w:t>
+            </w:r>
+            <w:proofErr w:type="spellStart"/>
+            <w:r>
+              <w:t>team.month_year</w:t>
+            </w:r>
+            <w:proofErr w:type="spellEnd"/>
+            <w:r>
+              <w:t>}}</w:t>
             </w:r>
           </w:p>
         </w:tc>
@@ -5822,7 +6483,15 @@
               </w:rPr>
             </w:pPr>
             <w:r>
-              <w:t>{% endfor %}</w:t>
+              <w:t xml:space="preserve">{% </w:t>
+            </w:r>
+            <w:proofErr w:type="spellStart"/>
+            <w:r>
+              <w:t>endfor</w:t>
+            </w:r>
+            <w:proofErr w:type="spellEnd"/>
+            <w:r>
+              <w:t xml:space="preserve"> %}</w:t>
             </w:r>
           </w:p>
         </w:tc>
@@ -5897,646 +6566,6 @@
               </w:rPr>
             </w:pPr>
           </w:p>
-        </w:tc>
-        <w:tc>
-          <w:tcPr>
-            <w:tcW w:w="1701" w:type="dxa"/>
-          </w:tcPr>
-          <w:p>
-            <w:pPr>
-              <w:rPr>
-                <w:b/>
-                <w:sz w:val="28"/>
-                <w:szCs w:val="28"/>
-              </w:rPr>
-            </w:pPr>
-          </w:p>
-        </w:tc>
-        <w:tc>
-          <w:tcPr>
-            <w:tcW w:w="1701" w:type="dxa"/>
-          </w:tcPr>
-          <w:p>
-            <w:pPr>
-              <w:rPr>
-                <w:b/>
-                <w:sz w:val="28"/>
-                <w:szCs w:val="28"/>
-              </w:rPr>
-            </w:pPr>
-          </w:p>
-        </w:tc>
-        <w:tc>
-          <w:tcPr>
-            <w:tcW w:w="1984" w:type="dxa"/>
-          </w:tcPr>
-          <w:p>
-            <w:pPr>
-              <w:rPr>
-                <w:b/>
-                <w:sz w:val="28"/>
-                <w:szCs w:val="28"/>
-              </w:rPr>
-            </w:pPr>
-          </w:p>
-        </w:tc>
-        <w:tc>
-          <w:tcPr>
-            <w:tcW w:w="1701" w:type="dxa"/>
-          </w:tcPr>
-          <w:p>
-            <w:pPr>
-              <w:rPr>
-                <w:b/>
-                <w:sz w:val="28"/>
-                <w:szCs w:val="28"/>
-              </w:rPr>
-            </w:pPr>
-          </w:p>
-        </w:tc>
-      </w:tr>
-      <w:tr>
-        <w:tc>
-          <w:tcPr>
-            <w:tcW w:w="1980" w:type="dxa"/>
-          </w:tcPr>
-          <w:p>
-            <w:pPr>
-              <w:rPr>
-                <w:b/>
-                <w:sz w:val="28"/>
-                <w:szCs w:val="28"/>
-              </w:rPr>
-            </w:pPr>
-          </w:p>
-        </w:tc>
-        <w:tc>
-          <w:tcPr>
-            <w:tcW w:w="1701" w:type="dxa"/>
-          </w:tcPr>
-          <w:p>
-            <w:pPr>
-              <w:rPr>
-                <w:b/>
-                <w:sz w:val="28"/>
-                <w:szCs w:val="28"/>
-              </w:rPr>
-            </w:pPr>
-          </w:p>
-        </w:tc>
-        <w:tc>
-          <w:tcPr>
-            <w:tcW w:w="1701" w:type="dxa"/>
-          </w:tcPr>
-          <w:p>
-            <w:pPr>
-              <w:rPr>
-                <w:b/>
-                <w:sz w:val="28"/>
-                <w:szCs w:val="28"/>
-              </w:rPr>
-            </w:pPr>
-          </w:p>
-        </w:tc>
-        <w:tc>
-          <w:tcPr>
-            <w:tcW w:w="1984" w:type="dxa"/>
-          </w:tcPr>
-          <w:p>
-            <w:pPr>
-              <w:rPr>
-                <w:b/>
-                <w:sz w:val="28"/>
-                <w:szCs w:val="28"/>
-              </w:rPr>
-            </w:pPr>
-          </w:p>
-        </w:tc>
-        <w:tc>
-          <w:tcPr>
-            <w:tcW w:w="1701" w:type="dxa"/>
-          </w:tcPr>
-          <w:p>
-            <w:pPr>
-              <w:rPr>
-                <w:b/>
-                <w:sz w:val="28"/>
-                <w:szCs w:val="28"/>
-              </w:rPr>
-            </w:pPr>
-          </w:p>
-        </w:tc>
-      </w:tr>
-      <w:tr>
-        <w:tc>
-          <w:tcPr>
-            <w:tcW w:w="1980" w:type="dxa"/>
-          </w:tcPr>
-          <w:p>
-            <w:pPr>
-              <w:rPr>
-                <w:b/>
-                <w:sz w:val="28"/>
-                <w:szCs w:val="28"/>
-              </w:rPr>
-            </w:pPr>
-          </w:p>
-        </w:tc>
-        <w:tc>
-          <w:tcPr>
-            <w:tcW w:w="1701" w:type="dxa"/>
-          </w:tcPr>
-          <w:p>
-            <w:pPr>
-              <w:rPr>
-                <w:b/>
-                <w:sz w:val="28"/>
-                <w:szCs w:val="28"/>
-              </w:rPr>
-            </w:pPr>
-          </w:p>
-        </w:tc>
-        <w:tc>
-          <w:tcPr>
-            <w:tcW w:w="1701" w:type="dxa"/>
-          </w:tcPr>
-          <w:p>
-            <w:pPr>
-              <w:rPr>
-                <w:b/>
-                <w:sz w:val="28"/>
-                <w:szCs w:val="28"/>
-              </w:rPr>
-            </w:pPr>
-          </w:p>
-        </w:tc>
-        <w:tc>
-          <w:tcPr>
-            <w:tcW w:w="1984" w:type="dxa"/>
-          </w:tcPr>
-          <w:p>
-            <w:pPr>
-              <w:rPr>
-                <w:b/>
-                <w:sz w:val="28"/>
-                <w:szCs w:val="28"/>
-              </w:rPr>
-            </w:pPr>
-          </w:p>
-        </w:tc>
-        <w:tc>
-          <w:tcPr>
-            <w:tcW w:w="1701" w:type="dxa"/>
-          </w:tcPr>
-          <w:p>
-            <w:pPr>
-              <w:rPr>
-                <w:b/>
-                <w:sz w:val="28"/>
-                <w:szCs w:val="28"/>
-              </w:rPr>
-            </w:pPr>
-          </w:p>
-        </w:tc>
-      </w:tr>
-      <w:tr>
-        <w:tc>
-          <w:tcPr>
-            <w:tcW w:w="1980" w:type="dxa"/>
-          </w:tcPr>
-          <w:p>
-            <w:pPr>
-              <w:rPr>
-                <w:b/>
-                <w:sz w:val="28"/>
-                <w:szCs w:val="28"/>
-              </w:rPr>
-            </w:pPr>
-          </w:p>
-        </w:tc>
-        <w:tc>
-          <w:tcPr>
-            <w:tcW w:w="1701" w:type="dxa"/>
-          </w:tcPr>
-          <w:p>
-            <w:pPr>
-              <w:rPr>
-                <w:b/>
-                <w:sz w:val="28"/>
-                <w:szCs w:val="28"/>
-              </w:rPr>
-            </w:pPr>
-          </w:p>
-        </w:tc>
-        <w:tc>
-          <w:tcPr>
-            <w:tcW w:w="1701" w:type="dxa"/>
-          </w:tcPr>
-          <w:p>
-            <w:pPr>
-              <w:rPr>
-                <w:b/>
-                <w:sz w:val="28"/>
-                <w:szCs w:val="28"/>
-              </w:rPr>
-            </w:pPr>
-          </w:p>
-        </w:tc>
-        <w:tc>
-          <w:tcPr>
-            <w:tcW w:w="1984" w:type="dxa"/>
-          </w:tcPr>
-          <w:p>
-            <w:pPr>
-              <w:rPr>
-                <w:b/>
-                <w:sz w:val="28"/>
-                <w:szCs w:val="28"/>
-              </w:rPr>
-            </w:pPr>
-          </w:p>
-        </w:tc>
-        <w:tc>
-          <w:tcPr>
-            <w:tcW w:w="1701" w:type="dxa"/>
-          </w:tcPr>
-          <w:p>
-            <w:pPr>
-              <w:rPr>
-                <w:b/>
-                <w:sz w:val="28"/>
-                <w:szCs w:val="28"/>
-              </w:rPr>
-            </w:pPr>
-          </w:p>
-        </w:tc>
-      </w:tr>
-      <w:tr>
-        <w:tc>
-          <w:tcPr>
-            <w:tcW w:w="1980" w:type="dxa"/>
-          </w:tcPr>
-          <w:p>
-            <w:pPr>
-              <w:rPr>
-                <w:b/>
-                <w:sz w:val="28"/>
-                <w:szCs w:val="28"/>
-              </w:rPr>
-            </w:pPr>
-          </w:p>
-        </w:tc>
-        <w:tc>
-          <w:tcPr>
-            <w:tcW w:w="1701" w:type="dxa"/>
-          </w:tcPr>
-          <w:p>
-            <w:pPr>
-              <w:rPr>
-                <w:b/>
-                <w:sz w:val="28"/>
-                <w:szCs w:val="28"/>
-              </w:rPr>
-            </w:pPr>
-          </w:p>
-        </w:tc>
-        <w:tc>
-          <w:tcPr>
-            <w:tcW w:w="1701" w:type="dxa"/>
-          </w:tcPr>
-          <w:p>
-            <w:pPr>
-              <w:rPr>
-                <w:b/>
-                <w:sz w:val="28"/>
-                <w:szCs w:val="28"/>
-              </w:rPr>
-            </w:pPr>
-          </w:p>
-        </w:tc>
-        <w:tc>
-          <w:tcPr>
-            <w:tcW w:w="1984" w:type="dxa"/>
-          </w:tcPr>
-          <w:p>
-            <w:pPr>
-              <w:rPr>
-                <w:b/>
-                <w:sz w:val="28"/>
-                <w:szCs w:val="28"/>
-              </w:rPr>
-            </w:pPr>
-          </w:p>
-        </w:tc>
-        <w:tc>
-          <w:tcPr>
-            <w:tcW w:w="1701" w:type="dxa"/>
-          </w:tcPr>
-          <w:p>
-            <w:pPr>
-              <w:rPr>
-                <w:b/>
-                <w:sz w:val="28"/>
-                <w:szCs w:val="28"/>
-              </w:rPr>
-            </w:pPr>
-          </w:p>
-        </w:tc>
-      </w:tr>
-      <w:tr>
-        <w:tc>
-          <w:tcPr>
-            <w:tcW w:w="1980" w:type="dxa"/>
-          </w:tcPr>
-          <w:p>
-            <w:pPr>
-              <w:rPr>
-                <w:b/>
-                <w:sz w:val="28"/>
-                <w:szCs w:val="28"/>
-              </w:rPr>
-            </w:pPr>
-          </w:p>
-        </w:tc>
-        <w:tc>
-          <w:tcPr>
-            <w:tcW w:w="1701" w:type="dxa"/>
-          </w:tcPr>
-          <w:p>
-            <w:pPr>
-              <w:rPr>
-                <w:b/>
-                <w:sz w:val="28"/>
-                <w:szCs w:val="28"/>
-              </w:rPr>
-            </w:pPr>
-          </w:p>
-        </w:tc>
-        <w:tc>
-          <w:tcPr>
-            <w:tcW w:w="1701" w:type="dxa"/>
-          </w:tcPr>
-          <w:p>
-            <w:pPr>
-              <w:rPr>
-                <w:b/>
-                <w:sz w:val="28"/>
-                <w:szCs w:val="28"/>
-              </w:rPr>
-            </w:pPr>
-          </w:p>
-        </w:tc>
-        <w:tc>
-          <w:tcPr>
-            <w:tcW w:w="1984" w:type="dxa"/>
-          </w:tcPr>
-          <w:p>
-            <w:pPr>
-              <w:rPr>
-                <w:b/>
-                <w:sz w:val="28"/>
-                <w:szCs w:val="28"/>
-              </w:rPr>
-            </w:pPr>
-          </w:p>
-        </w:tc>
-        <w:tc>
-          <w:tcPr>
-            <w:tcW w:w="1701" w:type="dxa"/>
-          </w:tcPr>
-          <w:p>
-            <w:pPr>
-              <w:rPr>
-                <w:b/>
-                <w:sz w:val="28"/>
-                <w:szCs w:val="28"/>
-              </w:rPr>
-            </w:pPr>
-          </w:p>
-        </w:tc>
-      </w:tr>
-      <w:tr>
-        <w:tc>
-          <w:tcPr>
-            <w:tcW w:w="1980" w:type="dxa"/>
-          </w:tcPr>
-          <w:p>
-            <w:pPr>
-              <w:rPr>
-                <w:b/>
-                <w:sz w:val="28"/>
-                <w:szCs w:val="28"/>
-              </w:rPr>
-            </w:pPr>
-          </w:p>
-        </w:tc>
-        <w:tc>
-          <w:tcPr>
-            <w:tcW w:w="1701" w:type="dxa"/>
-          </w:tcPr>
-          <w:p>
-            <w:pPr>
-              <w:rPr>
-                <w:b/>
-                <w:sz w:val="28"/>
-                <w:szCs w:val="28"/>
-              </w:rPr>
-            </w:pPr>
-          </w:p>
-        </w:tc>
-        <w:tc>
-          <w:tcPr>
-            <w:tcW w:w="1701" w:type="dxa"/>
-          </w:tcPr>
-          <w:p>
-            <w:pPr>
-              <w:rPr>
-                <w:b/>
-                <w:sz w:val="28"/>
-                <w:szCs w:val="28"/>
-              </w:rPr>
-            </w:pPr>
-          </w:p>
-        </w:tc>
-        <w:tc>
-          <w:tcPr>
-            <w:tcW w:w="1984" w:type="dxa"/>
-          </w:tcPr>
-          <w:p>
-            <w:pPr>
-              <w:rPr>
-                <w:b/>
-                <w:sz w:val="28"/>
-                <w:szCs w:val="28"/>
-              </w:rPr>
-            </w:pPr>
-          </w:p>
-        </w:tc>
-        <w:tc>
-          <w:tcPr>
-            <w:tcW w:w="1701" w:type="dxa"/>
-          </w:tcPr>
-          <w:p>
-            <w:pPr>
-              <w:rPr>
-                <w:b/>
-                <w:sz w:val="28"/>
-                <w:szCs w:val="28"/>
-              </w:rPr>
-            </w:pPr>
-          </w:p>
-        </w:tc>
-      </w:tr>
-      <w:tr>
-        <w:tc>
-          <w:tcPr>
-            <w:tcW w:w="1980" w:type="dxa"/>
-          </w:tcPr>
-          <w:p>
-            <w:pPr>
-              <w:rPr>
-                <w:b/>
-                <w:sz w:val="28"/>
-                <w:szCs w:val="28"/>
-              </w:rPr>
-            </w:pPr>
-          </w:p>
-        </w:tc>
-        <w:tc>
-          <w:tcPr>
-            <w:tcW w:w="1701" w:type="dxa"/>
-          </w:tcPr>
-          <w:p>
-            <w:pPr>
-              <w:rPr>
-                <w:b/>
-                <w:sz w:val="28"/>
-                <w:szCs w:val="28"/>
-              </w:rPr>
-            </w:pPr>
-          </w:p>
-        </w:tc>
-        <w:tc>
-          <w:tcPr>
-            <w:tcW w:w="1701" w:type="dxa"/>
-          </w:tcPr>
-          <w:p>
-            <w:pPr>
-              <w:rPr>
-                <w:b/>
-                <w:sz w:val="28"/>
-                <w:szCs w:val="28"/>
-              </w:rPr>
-            </w:pPr>
-          </w:p>
-        </w:tc>
-        <w:tc>
-          <w:tcPr>
-            <w:tcW w:w="1984" w:type="dxa"/>
-          </w:tcPr>
-          <w:p>
-            <w:pPr>
-              <w:rPr>
-                <w:b/>
-                <w:sz w:val="28"/>
-                <w:szCs w:val="28"/>
-              </w:rPr>
-            </w:pPr>
-          </w:p>
-        </w:tc>
-        <w:tc>
-          <w:tcPr>
-            <w:tcW w:w="1701" w:type="dxa"/>
-          </w:tcPr>
-          <w:p>
-            <w:pPr>
-              <w:rPr>
-                <w:b/>
-                <w:sz w:val="28"/>
-                <w:szCs w:val="28"/>
-              </w:rPr>
-            </w:pPr>
-          </w:p>
-        </w:tc>
-      </w:tr>
-      <w:tr>
-        <w:tc>
-          <w:tcPr>
-            <w:tcW w:w="1980" w:type="dxa"/>
-          </w:tcPr>
-          <w:p>
-            <w:pPr>
-              <w:rPr>
-                <w:b/>
-                <w:sz w:val="28"/>
-                <w:szCs w:val="28"/>
-              </w:rPr>
-            </w:pPr>
-          </w:p>
-        </w:tc>
-        <w:tc>
-          <w:tcPr>
-            <w:tcW w:w="1701" w:type="dxa"/>
-          </w:tcPr>
-          <w:p>
-            <w:pPr>
-              <w:rPr>
-                <w:b/>
-                <w:sz w:val="28"/>
-                <w:szCs w:val="28"/>
-              </w:rPr>
-            </w:pPr>
-          </w:p>
-        </w:tc>
-        <w:tc>
-          <w:tcPr>
-            <w:tcW w:w="1701" w:type="dxa"/>
-          </w:tcPr>
-          <w:p>
-            <w:pPr>
-              <w:rPr>
-                <w:b/>
-                <w:sz w:val="28"/>
-                <w:szCs w:val="28"/>
-              </w:rPr>
-            </w:pPr>
-          </w:p>
-        </w:tc>
-        <w:tc>
-          <w:tcPr>
-            <w:tcW w:w="1984" w:type="dxa"/>
-          </w:tcPr>
-          <w:p>
-            <w:pPr>
-              <w:rPr>
-                <w:b/>
-                <w:sz w:val="28"/>
-                <w:szCs w:val="28"/>
-              </w:rPr>
-            </w:pPr>
-          </w:p>
-        </w:tc>
-        <w:tc>
-          <w:tcPr>
-            <w:tcW w:w="1701" w:type="dxa"/>
-          </w:tcPr>
-          <w:p>
-            <w:pPr>
-              <w:rPr>
-                <w:b/>
-                <w:sz w:val="28"/>
-                <w:szCs w:val="28"/>
-              </w:rPr>
-            </w:pPr>
-          </w:p>
-        </w:tc>
-      </w:tr>
-      <w:tr>
-        <w:tc>
-          <w:tcPr>
-            <w:tcW w:w="1980" w:type="dxa"/>
-          </w:tcPr>
-          <w:p/>
         </w:tc>
         <w:tc>
           <w:tcPr>
@@ -6878,7 +6907,23 @@
               </w:rPr>
             </w:pPr>
             <w:r>
-              <w:t>{{ WorkHighlight[0].publishable_summary }}</w:t>
+              <w:t xml:space="preserve">{{ </w:t>
+            </w:r>
+            <w:proofErr w:type="spellStart"/>
+            <w:r>
+              <w:t>WorkHighlight</w:t>
+            </w:r>
+            <w:proofErr w:type="spellEnd"/>
+            <w:r>
+              <w:t>[0].</w:t>
+            </w:r>
+            <w:proofErr w:type="spellStart"/>
+            <w:r>
+              <w:t>publishable_summary</w:t>
+            </w:r>
+            <w:proofErr w:type="spellEnd"/>
+            <w:r>
+              <w:t xml:space="preserve"> }}</w:t>
             </w:r>
           </w:p>
         </w:tc>
@@ -6951,7 +6996,23 @@
               </w:rPr>
             </w:pPr>
             <w:r>
-              <w:t>{{ WorkHighlight[1].publishable_summary }}</w:t>
+              <w:t xml:space="preserve">{{ </w:t>
+            </w:r>
+            <w:proofErr w:type="spellStart"/>
+            <w:r>
+              <w:t>WorkHighlight</w:t>
+            </w:r>
+            <w:proofErr w:type="spellEnd"/>
+            <w:r>
+              <w:t>[1].</w:t>
+            </w:r>
+            <w:proofErr w:type="spellStart"/>
+            <w:r>
+              <w:t>publishable_summary</w:t>
+            </w:r>
+            <w:proofErr w:type="spellEnd"/>
+            <w:r>
+              <w:t xml:space="preserve"> }}</w:t>
             </w:r>
           </w:p>
         </w:tc>
@@ -7033,7 +7094,23 @@
               </w:rPr>
             </w:pPr>
             <w:r>
-              <w:t>{{ WorkHighlight[2].publishable_summary }}</w:t>
+              <w:t xml:space="preserve">{{ </w:t>
+            </w:r>
+            <w:proofErr w:type="spellStart"/>
+            <w:r>
+              <w:t>WorkHighlight</w:t>
+            </w:r>
+            <w:proofErr w:type="spellEnd"/>
+            <w:r>
+              <w:t>[2].</w:t>
+            </w:r>
+            <w:proofErr w:type="spellStart"/>
+            <w:r>
+              <w:t>publishable_summary</w:t>
+            </w:r>
+            <w:proofErr w:type="spellEnd"/>
+            <w:r>
+              <w:t xml:space="preserve"> }}</w:t>
             </w:r>
           </w:p>
         </w:tc>
@@ -7141,10 +7218,7 @@
         <w:t xml:space="preserve"> %}</w:t>
       </w:r>
     </w:p>
-    <w:p>
-      <w:bookmarkStart w:id="0" w:name="_GoBack"/>
-      <w:bookmarkEnd w:id="0"/>
-    </w:p>
+    <w:p/>
     <w:tbl>
       <w:tblPr>
         <w:tblStyle w:val="Tablaconcuadrcula"/>
@@ -7268,6 +7342,7 @@
               </w:rPr>
               <w:t xml:space="preserve">{{ </w:t>
             </w:r>
+            <w:proofErr w:type="spellStart"/>
             <w:r>
               <w:rPr>
                 <w:b/>
@@ -7282,7 +7357,16 @@
                 <w:sz w:val="28"/>
                 <w:szCs w:val="28"/>
               </w:rPr>
-              <w:t>.client_name }}</w:t>
+              <w:t>.client_name</w:t>
+            </w:r>
+            <w:proofErr w:type="spellEnd"/>
+            <w:r>
+              <w:rPr>
+                <w:b/>
+                <w:sz w:val="28"/>
+                <w:szCs w:val="28"/>
+              </w:rPr>
+              <w:t xml:space="preserve"> }}</w:t>
             </w:r>
           </w:p>
         </w:tc>
@@ -7308,6 +7392,7 @@
               </w:rPr>
               <w:t xml:space="preserve">{{ </w:t>
             </w:r>
+            <w:proofErr w:type="spellStart"/>
             <w:r>
               <w:rPr>
                 <w:b/>
@@ -7324,6 +7409,7 @@
               </w:rPr>
               <w:t>.industry_sector</w:t>
             </w:r>
+            <w:proofErr w:type="spellEnd"/>
             <w:r>
               <w:rPr>
                 <w:b/>
@@ -7393,6 +7479,7 @@
               </w:rPr>
               <w:t xml:space="preserve">{{ </w:t>
             </w:r>
+            <w:proofErr w:type="spellStart"/>
             <w:r>
               <w:rPr>
                 <w:sz w:val="20"/>
@@ -7407,6 +7494,7 @@
               </w:rPr>
               <w:t>.matter_description</w:t>
             </w:r>
+            <w:proofErr w:type="spellEnd"/>
             <w:r>
               <w:rPr>
                 <w:sz w:val="20"/>
@@ -7475,6 +7563,7 @@
               </w:rPr>
               <w:t xml:space="preserve">{{ </w:t>
             </w:r>
+            <w:proofErr w:type="spellStart"/>
             <w:r>
               <w:rPr>
                 <w:b/>
@@ -7491,6 +7580,7 @@
               </w:rPr>
               <w:t>.deal_value</w:t>
             </w:r>
+            <w:proofErr w:type="spellEnd"/>
             <w:r>
               <w:rPr>
                 <w:b/>
@@ -7599,6 +7689,7 @@
               </w:rPr>
               <w:t xml:space="preserve">{{ </w:t>
             </w:r>
+            <w:proofErr w:type="spellStart"/>
             <w:r>
               <w:rPr>
                 <w:b/>
@@ -7615,6 +7706,7 @@
               </w:rPr>
               <w:t>.jurisdictions_involved</w:t>
             </w:r>
+            <w:proofErr w:type="spellEnd"/>
             <w:r>
               <w:rPr>
                 <w:b/>
@@ -7770,12 +7862,14 @@
             <w:r>
               <w:t xml:space="preserve">{{ </w:t>
             </w:r>
+            <w:proofErr w:type="spellStart"/>
             <w:r>
               <w:t>matter</w:t>
             </w:r>
             <w:r>
               <w:t>.lead_partners</w:t>
             </w:r>
+            <w:proofErr w:type="spellEnd"/>
             <w:r>
               <w:t>[0]</w:t>
             </w:r>
@@ -7801,11 +7895,16 @@
             <w:r>
               <w:t xml:space="preserve">{{ </w:t>
             </w:r>
+            <w:proofErr w:type="spellStart"/>
             <w:r>
               <w:t>matter</w:t>
             </w:r>
             <w:r>
-              <w:t>.lead_partners[0].office }}</w:t>
+              <w:t>.lead_partners</w:t>
+            </w:r>
+            <w:proofErr w:type="spellEnd"/>
+            <w:r>
+              <w:t>[0].office }}</w:t>
             </w:r>
           </w:p>
         </w:tc>
@@ -7825,11 +7924,16 @@
             <w:r>
               <w:t xml:space="preserve">{{ </w:t>
             </w:r>
+            <w:proofErr w:type="spellStart"/>
             <w:r>
               <w:t>matter</w:t>
             </w:r>
             <w:r>
-              <w:t>.lead_partners.practice_area }}</w:t>
+              <w:t>.lead_partners.practice_area</w:t>
+            </w:r>
+            <w:proofErr w:type="spellEnd"/>
+            <w:r>
+              <w:t xml:space="preserve"> }}</w:t>
             </w:r>
           </w:p>
         </w:tc>
@@ -7855,11 +7959,16 @@
             <w:r>
               <w:t xml:space="preserve">{{ </w:t>
             </w:r>
+            <w:proofErr w:type="spellStart"/>
             <w:r>
               <w:t>matter</w:t>
             </w:r>
             <w:r>
-              <w:t>.lead_partners[1].name }}</w:t>
+              <w:t>.lead_partners</w:t>
+            </w:r>
+            <w:proofErr w:type="spellEnd"/>
+            <w:r>
+              <w:t>[1].name }}</w:t>
             </w:r>
           </w:p>
         </w:tc>
@@ -7883,11 +7992,16 @@
             <w:r>
               <w:t xml:space="preserve">{{ </w:t>
             </w:r>
+            <w:proofErr w:type="spellStart"/>
             <w:r>
               <w:t>matter</w:t>
             </w:r>
             <w:r>
-              <w:t>.lead_partners[1].office }}</w:t>
+              <w:t>.lead_partners</w:t>
+            </w:r>
+            <w:proofErr w:type="spellEnd"/>
+            <w:r>
+              <w:t>[1].office }}</w:t>
             </w:r>
           </w:p>
         </w:tc>
@@ -7910,11 +8024,24 @@
             <w:r>
               <w:t xml:space="preserve">{{ </w:t>
             </w:r>
+            <w:proofErr w:type="spellStart"/>
             <w:r>
               <w:t>matter</w:t>
             </w:r>
             <w:r>
-              <w:t>.lead_partners[1].practice_area }}</w:t>
+              <w:t>.lead_partners</w:t>
+            </w:r>
+            <w:proofErr w:type="spellEnd"/>
+            <w:r>
+              <w:t>[1].</w:t>
+            </w:r>
+            <w:proofErr w:type="spellStart"/>
+            <w:r>
+              <w:t>practice_area</w:t>
+            </w:r>
+            <w:proofErr w:type="spellEnd"/>
+            <w:r>
+              <w:t xml:space="preserve"> }}</w:t>
             </w:r>
           </w:p>
         </w:tc>
@@ -8042,11 +8169,16 @@
             <w:r>
               <w:t xml:space="preserve">{{ </w:t>
             </w:r>
+            <w:proofErr w:type="spellStart"/>
             <w:r>
               <w:t>matter</w:t>
             </w:r>
             <w:r>
-              <w:t>.other_key_team_members[0].name }}</w:t>
+              <w:t>.other_key_team_members</w:t>
+            </w:r>
+            <w:proofErr w:type="spellEnd"/>
+            <w:r>
+              <w:t>[0].name }}</w:t>
             </w:r>
           </w:p>
         </w:tc>
@@ -8067,12 +8199,14 @@
             <w:r>
               <w:t xml:space="preserve">{{ </w:t>
             </w:r>
+            <w:proofErr w:type="spellStart"/>
             <w:r>
               <w:t>matter</w:t>
             </w:r>
             <w:r>
               <w:t>.other_key_team_members</w:t>
             </w:r>
+            <w:proofErr w:type="spellEnd"/>
             <w:r>
               <w:t>[0]</w:t>
             </w:r>
@@ -8097,11 +8231,24 @@
             <w:r>
               <w:t xml:space="preserve">{{ </w:t>
             </w:r>
+            <w:proofErr w:type="spellStart"/>
             <w:r>
               <w:t>matter</w:t>
             </w:r>
             <w:r>
-              <w:t>.other_key_team_members[0].practice_area }}</w:t>
+              <w:t>.other_key_team_members</w:t>
+            </w:r>
+            <w:proofErr w:type="spellEnd"/>
+            <w:r>
+              <w:t>[0].</w:t>
+            </w:r>
+            <w:proofErr w:type="spellStart"/>
+            <w:r>
+              <w:t>practice_area</w:t>
+            </w:r>
+            <w:proofErr w:type="spellEnd"/>
+            <w:r>
+              <w:t xml:space="preserve"> }}</w:t>
             </w:r>
           </w:p>
         </w:tc>
@@ -8127,11 +8274,16 @@
             <w:r>
               <w:t xml:space="preserve">{{ </w:t>
             </w:r>
+            <w:proofErr w:type="spellStart"/>
             <w:r>
               <w:t>matter</w:t>
             </w:r>
             <w:r>
-              <w:t>.other_key_team_members[1].name }}</w:t>
+              <w:t>.other_key_team_members</w:t>
+            </w:r>
+            <w:proofErr w:type="spellEnd"/>
+            <w:r>
+              <w:t>[1].name }}</w:t>
             </w:r>
           </w:p>
         </w:tc>
@@ -8155,11 +8307,16 @@
             <w:r>
               <w:t xml:space="preserve">{{ </w:t>
             </w:r>
+            <w:proofErr w:type="spellStart"/>
             <w:r>
               <w:t>matter</w:t>
             </w:r>
             <w:r>
-              <w:t>.other_key_team_members[1].office }}</w:t>
+              <w:t>.other_key_team_members</w:t>
+            </w:r>
+            <w:proofErr w:type="spellEnd"/>
+            <w:r>
+              <w:t>[1].office }}</w:t>
             </w:r>
           </w:p>
         </w:tc>
@@ -8182,11 +8339,24 @@
             <w:r>
               <w:t xml:space="preserve">{{ </w:t>
             </w:r>
+            <w:proofErr w:type="spellStart"/>
             <w:r>
               <w:t>matter</w:t>
             </w:r>
             <w:r>
-              <w:t>.other_key_team_members[1].practice_area }}</w:t>
+              <w:t>.other_key_team_members</w:t>
+            </w:r>
+            <w:proofErr w:type="spellEnd"/>
+            <w:r>
+              <w:t>[1].</w:t>
+            </w:r>
+            <w:proofErr w:type="spellStart"/>
+            <w:r>
+              <w:t>practice_area</w:t>
+            </w:r>
+            <w:proofErr w:type="spellEnd"/>
+            <w:r>
+              <w:t xml:space="preserve"> }}</w:t>
             </w:r>
           </w:p>
         </w:tc>
@@ -8341,6 +8511,7 @@
               <w:lastRenderedPageBreak/>
               <w:t xml:space="preserve">{{ </w:t>
             </w:r>
+            <w:proofErr w:type="spellStart"/>
             <w:r>
               <w:rPr>
                 <w:b/>
@@ -8357,6 +8528,7 @@
               </w:rPr>
               <w:t>.external_firms_advising.firm_name</w:t>
             </w:r>
+            <w:proofErr w:type="spellEnd"/>
             <w:r>
               <w:rPr>
                 <w:b/>
@@ -8389,6 +8561,7 @@
               </w:rPr>
               <w:t xml:space="preserve">{{ </w:t>
             </w:r>
+            <w:proofErr w:type="spellStart"/>
             <w:r>
               <w:rPr>
                 <w:b/>
@@ -8403,8 +8576,27 @@
                 <w:sz w:val="28"/>
                 <w:szCs w:val="28"/>
               </w:rPr>
-              <w:t>.external_firms_advising[0].role_details</w:t>
-            </w:r>
+              <w:t>.external_firms_advising</w:t>
+            </w:r>
+            <w:proofErr w:type="spellEnd"/>
+            <w:r>
+              <w:rPr>
+                <w:b/>
+                <w:sz w:val="28"/>
+                <w:szCs w:val="28"/>
+              </w:rPr>
+              <w:t>[0].</w:t>
+            </w:r>
+            <w:proofErr w:type="spellStart"/>
+            <w:r>
+              <w:rPr>
+                <w:b/>
+                <w:sz w:val="28"/>
+                <w:szCs w:val="28"/>
+              </w:rPr>
+              <w:t>role_details</w:t>
+            </w:r>
+            <w:proofErr w:type="spellEnd"/>
             <w:r>
               <w:rPr>
                 <w:b/>
@@ -8436,6 +8628,7 @@
               </w:rPr>
               <w:t xml:space="preserve">{{ </w:t>
             </w:r>
+            <w:proofErr w:type="spellStart"/>
             <w:r>
               <w:rPr>
                 <w:b/>
@@ -8452,6 +8645,7 @@
               </w:rPr>
               <w:t>.external_firms_advising.entity_advised</w:t>
             </w:r>
+            <w:proofErr w:type="spellEnd"/>
             <w:r>
               <w:rPr>
                 <w:b/>
@@ -8548,6 +8742,7 @@
               </w:rPr>
               <w:t xml:space="preserve">{{ </w:t>
             </w:r>
+            <w:proofErr w:type="spellStart"/>
             <w:r>
               <w:rPr>
                 <w:b/>
@@ -8564,6 +8759,7 @@
               </w:rPr>
               <w:t>.dates.start</w:t>
             </w:r>
+            <w:proofErr w:type="spellEnd"/>
             <w:r>
               <w:rPr>
                 <w:b/>
@@ -8599,6 +8795,7 @@
               </w:rPr>
               <w:t xml:space="preserve">{{ </w:t>
             </w:r>
+            <w:proofErr w:type="spellStart"/>
             <w:r>
               <w:rPr>
                 <w:b/>
@@ -8615,6 +8812,7 @@
               </w:rPr>
               <w:t>.dates.end</w:t>
             </w:r>
+            <w:proofErr w:type="spellEnd"/>
             <w:r>
               <w:rPr>
                 <w:b/>
@@ -8664,7 +8862,15 @@
     </w:p>
     <w:p>
       <w:r>
-        <w:t>{% endfor %}</w:t>
+        <w:t xml:space="preserve">{% </w:t>
+      </w:r>
+      <w:proofErr w:type="spellStart"/>
+      <w:r>
+        <w:t>endfor</w:t>
+      </w:r>
+      <w:proofErr w:type="spellEnd"/>
+      <w:r>
+        <w:t xml:space="preserve"> %}</w:t>
       </w:r>
     </w:p>
     <w:p>
@@ -8679,9 +8885,11 @@
       <w:r>
         <w:t xml:space="preserve">{% for matter in </w:t>
       </w:r>
+      <w:proofErr w:type="spellStart"/>
       <w:r>
         <w:t>confidential_matters</w:t>
       </w:r>
+      <w:proofErr w:type="spellEnd"/>
       <w:r>
         <w:t xml:space="preserve"> %}</w:t>
       </w:r>
@@ -8703,8 +8911,6 @@
         <w:br w:type="page"/>
       </w:r>
     </w:p>
-    <w:p/>
-    <w:p/>
     <w:tbl>
       <w:tblPr>
         <w:tblStyle w:val="Tablaconcuadrcula"/>
@@ -8749,6 +8955,7 @@
                 <w:sz w:val="28"/>
                 <w:szCs w:val="28"/>
               </w:rPr>
+              <w:lastRenderedPageBreak/>
               <w:t>Non-publishable matter</w:t>
             </w:r>
           </w:p>
@@ -8827,7 +9034,25 @@
                 <w:sz w:val="28"/>
                 <w:szCs w:val="28"/>
               </w:rPr>
-              <w:t>{{ matter.client_name }}</w:t>
+              <w:t xml:space="preserve">{{ </w:t>
+            </w:r>
+            <w:proofErr w:type="spellStart"/>
+            <w:r>
+              <w:rPr>
+                <w:b/>
+                <w:sz w:val="28"/>
+                <w:szCs w:val="28"/>
+              </w:rPr>
+              <w:t>matter.client_name</w:t>
+            </w:r>
+            <w:proofErr w:type="spellEnd"/>
+            <w:r>
+              <w:rPr>
+                <w:b/>
+                <w:sz w:val="28"/>
+                <w:szCs w:val="28"/>
+              </w:rPr>
+              <w:t xml:space="preserve"> }}</w:t>
             </w:r>
           </w:p>
         </w:tc>
@@ -8851,8 +9076,18 @@
                 <w:sz w:val="28"/>
                 <w:szCs w:val="28"/>
               </w:rPr>
-              <w:t>{{ matter.industry_sector</w:t>
-            </w:r>
+              <w:t xml:space="preserve">{{ </w:t>
+            </w:r>
+            <w:proofErr w:type="spellStart"/>
+            <w:r>
+              <w:rPr>
+                <w:b/>
+                <w:sz w:val="28"/>
+                <w:szCs w:val="28"/>
+              </w:rPr>
+              <w:t>matter.industry_sector</w:t>
+            </w:r>
+            <w:proofErr w:type="spellEnd"/>
             <w:r>
               <w:rPr>
                 <w:b/>
@@ -8911,8 +9146,17 @@
                 <w:sz w:val="20"/>
                 <w:szCs w:val="20"/>
               </w:rPr>
-              <w:t>{{ matter.matter_description</w:t>
-            </w:r>
+              <w:t xml:space="preserve">{{ </w:t>
+            </w:r>
+            <w:proofErr w:type="spellStart"/>
+            <w:r>
+              <w:rPr>
+                <w:sz w:val="20"/>
+                <w:szCs w:val="20"/>
+              </w:rPr>
+              <w:t>matter.matter_description</w:t>
+            </w:r>
+            <w:proofErr w:type="spellEnd"/>
             <w:r>
               <w:rPr>
                 <w:sz w:val="20"/>
@@ -8979,8 +9223,18 @@
                 <w:sz w:val="28"/>
                 <w:szCs w:val="28"/>
               </w:rPr>
-              <w:t>{{ matter.deal_value</w:t>
-            </w:r>
+              <w:t xml:space="preserve">{{ </w:t>
+            </w:r>
+            <w:proofErr w:type="spellStart"/>
+            <w:r>
+              <w:rPr>
+                <w:b/>
+                <w:sz w:val="28"/>
+                <w:szCs w:val="28"/>
+              </w:rPr>
+              <w:t>matter.deal_value</w:t>
+            </w:r>
+            <w:proofErr w:type="spellEnd"/>
             <w:r>
               <w:rPr>
                 <w:b/>
@@ -9087,8 +9341,18 @@
                 <w:sz w:val="28"/>
                 <w:szCs w:val="28"/>
               </w:rPr>
-              <w:t>{{ matter.jurisdictions_involved</w:t>
-            </w:r>
+              <w:t xml:space="preserve">{{ </w:t>
+            </w:r>
+            <w:proofErr w:type="spellStart"/>
+            <w:r>
+              <w:rPr>
+                <w:b/>
+                <w:sz w:val="28"/>
+                <w:szCs w:val="28"/>
+              </w:rPr>
+              <w:t>matter.jurisdictions_involved</w:t>
+            </w:r>
+            <w:proofErr w:type="spellEnd"/>
             <w:r>
               <w:rPr>
                 <w:b/>
@@ -9235,13 +9499,21 @@
           </w:tcPr>
           <w:p>
             <w:r>
-              <w:t>{{ matter.</w:t>
+              <w:t xml:space="preserve">{{ </w:t>
+            </w:r>
+            <w:proofErr w:type="spellStart"/>
+            <w:r>
+              <w:t>matter.</w:t>
             </w:r>
             <w:r>
               <w:t>lead</w:t>
             </w:r>
             <w:r>
-              <w:t>_partners[0].name }}</w:t>
+              <w:t>_partners</w:t>
+            </w:r>
+            <w:proofErr w:type="spellEnd"/>
+            <w:r>
+              <w:t>[0].name }}</w:t>
             </w:r>
           </w:p>
         </w:tc>
@@ -9253,13 +9525,21 @@
           </w:tcPr>
           <w:p>
             <w:r>
-              <w:t>{{ matter.</w:t>
+              <w:t xml:space="preserve">{{ </w:t>
+            </w:r>
+            <w:proofErr w:type="spellStart"/>
+            <w:r>
+              <w:t>matter.</w:t>
             </w:r>
             <w:r>
               <w:t>lead</w:t>
             </w:r>
             <w:r>
-              <w:t>_partners[0].office }}</w:t>
+              <w:t>_partners</w:t>
+            </w:r>
+            <w:proofErr w:type="spellEnd"/>
+            <w:r>
+              <w:t>[0].office }}</w:t>
             </w:r>
           </w:p>
         </w:tc>
@@ -9270,13 +9550,29 @@
           </w:tcPr>
           <w:p>
             <w:r>
-              <w:t>{{ matter.</w:t>
+              <w:t xml:space="preserve">{{ </w:t>
+            </w:r>
+            <w:proofErr w:type="spellStart"/>
+            <w:r>
+              <w:t>matter.</w:t>
             </w:r>
             <w:r>
               <w:t>lead</w:t>
             </w:r>
             <w:r>
-              <w:t>_partners[0].practice_area }}</w:t>
+              <w:t>_partners</w:t>
+            </w:r>
+            <w:proofErr w:type="spellEnd"/>
+            <w:r>
+              <w:t>[0].</w:t>
+            </w:r>
+            <w:proofErr w:type="spellStart"/>
+            <w:r>
+              <w:t>practice_area</w:t>
+            </w:r>
+            <w:proofErr w:type="spellEnd"/>
+            <w:r>
+              <w:t xml:space="preserve"> }}</w:t>
             </w:r>
           </w:p>
         </w:tc>
@@ -9293,13 +9589,21 @@
           </w:tcPr>
           <w:p>
             <w:r>
-              <w:t>{{ matter.</w:t>
+              <w:t xml:space="preserve">{{ </w:t>
+            </w:r>
+            <w:proofErr w:type="spellStart"/>
+            <w:r>
+              <w:t>matter.</w:t>
             </w:r>
             <w:r>
               <w:t>lead</w:t>
             </w:r>
             <w:r>
-              <w:t>_partners[1].name }}</w:t>
+              <w:t>_partners</w:t>
+            </w:r>
+            <w:proofErr w:type="spellEnd"/>
+            <w:r>
+              <w:t>[1].name }}</w:t>
             </w:r>
           </w:p>
         </w:tc>
@@ -9314,13 +9618,21 @@
           </w:tcPr>
           <w:p>
             <w:r>
-              <w:t>{{ matter.</w:t>
+              <w:t xml:space="preserve">{{ </w:t>
+            </w:r>
+            <w:proofErr w:type="spellStart"/>
+            <w:r>
+              <w:t>matter.</w:t>
             </w:r>
             <w:r>
               <w:t>lead</w:t>
             </w:r>
             <w:r>
-              <w:t>_partners[1].office }}</w:t>
+              <w:t>_partners</w:t>
+            </w:r>
+            <w:proofErr w:type="spellEnd"/>
+            <w:r>
+              <w:t>[1].office }}</w:t>
             </w:r>
           </w:p>
         </w:tc>
@@ -9334,13 +9646,29 @@
           </w:tcPr>
           <w:p>
             <w:r>
-              <w:t>{{ matter.</w:t>
+              <w:t xml:space="preserve">{{ </w:t>
+            </w:r>
+            <w:proofErr w:type="spellStart"/>
+            <w:r>
+              <w:t>matter.</w:t>
             </w:r>
             <w:r>
               <w:t>lead</w:t>
             </w:r>
             <w:r>
-              <w:t>_partners[1].practice_area }}</w:t>
+              <w:t>_partners</w:t>
+            </w:r>
+            <w:proofErr w:type="spellEnd"/>
+            <w:r>
+              <w:t>[1].</w:t>
+            </w:r>
+            <w:proofErr w:type="spellStart"/>
+            <w:r>
+              <w:t>practice_area</w:t>
+            </w:r>
+            <w:proofErr w:type="spellEnd"/>
+            <w:r>
+              <w:t xml:space="preserve"> }}</w:t>
             </w:r>
           </w:p>
         </w:tc>
@@ -9459,11 +9787,16 @@
           </w:tcPr>
           <w:p>
             <w:r>
-              <w:t>{{ matter.</w:t>
+              <w:t xml:space="preserve">{{ </w:t>
+            </w:r>
+            <w:proofErr w:type="spellStart"/>
+            <w:r>
+              <w:t>matter.</w:t>
             </w:r>
             <w:r>
               <w:t>other_key_team_members</w:t>
             </w:r>
+            <w:proofErr w:type="spellEnd"/>
             <w:r>
               <w:t>[0].name }}</w:t>
             </w:r>
@@ -9477,11 +9810,16 @@
           </w:tcPr>
           <w:p>
             <w:r>
-              <w:t>{{ matter.</w:t>
+              <w:t xml:space="preserve">{{ </w:t>
+            </w:r>
+            <w:proofErr w:type="spellStart"/>
+            <w:r>
+              <w:t>matter.</w:t>
             </w:r>
             <w:r>
               <w:t>other_key_team_members</w:t>
             </w:r>
+            <w:proofErr w:type="spellEnd"/>
             <w:r>
               <w:t>[0].office }}</w:t>
             </w:r>
@@ -9494,13 +9832,26 @@
           </w:tcPr>
           <w:p>
             <w:r>
-              <w:t>{{ matter.</w:t>
+              <w:t xml:space="preserve">{{ </w:t>
+            </w:r>
+            <w:proofErr w:type="spellStart"/>
+            <w:r>
+              <w:t>matter.</w:t>
             </w:r>
             <w:r>
               <w:t>other_key_team_members</w:t>
             </w:r>
-            <w:r>
-              <w:t>[0].practice_area }}</w:t>
+            <w:proofErr w:type="spellEnd"/>
+            <w:r>
+              <w:t>[0].</w:t>
+            </w:r>
+            <w:proofErr w:type="spellStart"/>
+            <w:r>
+              <w:t>practice_area</w:t>
+            </w:r>
+            <w:proofErr w:type="spellEnd"/>
+            <w:r>
+              <w:t xml:space="preserve"> }}</w:t>
             </w:r>
           </w:p>
         </w:tc>
@@ -9517,11 +9868,16 @@
           </w:tcPr>
           <w:p>
             <w:r>
-              <w:t>{{ matter.</w:t>
+              <w:t xml:space="preserve">{{ </w:t>
+            </w:r>
+            <w:proofErr w:type="spellStart"/>
+            <w:r>
+              <w:t>matter.</w:t>
             </w:r>
             <w:r>
               <w:t>other_key_team_members</w:t>
             </w:r>
+            <w:proofErr w:type="spellEnd"/>
             <w:r>
               <w:t>[1].name }}</w:t>
             </w:r>
@@ -9538,11 +9894,16 @@
           </w:tcPr>
           <w:p>
             <w:r>
-              <w:t>{{ matter.</w:t>
+              <w:t xml:space="preserve">{{ </w:t>
+            </w:r>
+            <w:proofErr w:type="spellStart"/>
+            <w:r>
+              <w:t>matter.</w:t>
             </w:r>
             <w:r>
               <w:t>other_key_team_members</w:t>
             </w:r>
+            <w:proofErr w:type="spellEnd"/>
             <w:r>
               <w:t>[1].office }}</w:t>
             </w:r>
@@ -9558,13 +9919,26 @@
           </w:tcPr>
           <w:p>
             <w:r>
-              <w:t>{{ matter.</w:t>
+              <w:t xml:space="preserve">{{ </w:t>
+            </w:r>
+            <w:proofErr w:type="spellStart"/>
+            <w:r>
+              <w:t>matter.</w:t>
             </w:r>
             <w:r>
               <w:t>other_key_team_members</w:t>
             </w:r>
-            <w:r>
-              <w:t>[1].practice_area }}</w:t>
+            <w:proofErr w:type="spellEnd"/>
+            <w:r>
+              <w:t>[1].</w:t>
+            </w:r>
+            <w:proofErr w:type="spellStart"/>
+            <w:r>
+              <w:t>practice_area</w:t>
+            </w:r>
+            <w:proofErr w:type="spellEnd"/>
+            <w:r>
+              <w:t xml:space="preserve"> }}</w:t>
             </w:r>
           </w:p>
         </w:tc>
@@ -9625,7 +9999,6 @@
               <w:rPr>
                 <w:b/>
               </w:rPr>
-              <w:lastRenderedPageBreak/>
               <w:t>Firm name</w:t>
             </w:r>
           </w:p>
@@ -9717,8 +10090,37 @@
                 <w:sz w:val="28"/>
                 <w:szCs w:val="28"/>
               </w:rPr>
-              <w:t>{{ matter.external_firms_advising[0].firm_name</w:t>
-            </w:r>
+              <w:lastRenderedPageBreak/>
+              <w:t xml:space="preserve">{{ </w:t>
+            </w:r>
+            <w:proofErr w:type="spellStart"/>
+            <w:r>
+              <w:rPr>
+                <w:b/>
+                <w:sz w:val="28"/>
+                <w:szCs w:val="28"/>
+              </w:rPr>
+              <w:t>matter.external_firms_advising</w:t>
+            </w:r>
+            <w:proofErr w:type="spellEnd"/>
+            <w:r>
+              <w:rPr>
+                <w:b/>
+                <w:sz w:val="28"/>
+                <w:szCs w:val="28"/>
+              </w:rPr>
+              <w:t>[0].</w:t>
+            </w:r>
+            <w:proofErr w:type="spellStart"/>
+            <w:r>
+              <w:rPr>
+                <w:b/>
+                <w:sz w:val="28"/>
+                <w:szCs w:val="28"/>
+              </w:rPr>
+              <w:t>firm_name</w:t>
+            </w:r>
+            <w:proofErr w:type="spellEnd"/>
             <w:r>
               <w:rPr>
                 <w:b/>
@@ -9749,8 +10151,36 @@
                 <w:sz w:val="28"/>
                 <w:szCs w:val="28"/>
               </w:rPr>
-              <w:t>{{ matter.external_firms_advising[0].role_details</w:t>
-            </w:r>
+              <w:t xml:space="preserve">{{ </w:t>
+            </w:r>
+            <w:proofErr w:type="spellStart"/>
+            <w:r>
+              <w:rPr>
+                <w:b/>
+                <w:sz w:val="28"/>
+                <w:szCs w:val="28"/>
+              </w:rPr>
+              <w:t>matter.external_firms_advising</w:t>
+            </w:r>
+            <w:proofErr w:type="spellEnd"/>
+            <w:r>
+              <w:rPr>
+                <w:b/>
+                <w:sz w:val="28"/>
+                <w:szCs w:val="28"/>
+              </w:rPr>
+              <w:t>[0].</w:t>
+            </w:r>
+            <w:proofErr w:type="spellStart"/>
+            <w:r>
+              <w:rPr>
+                <w:b/>
+                <w:sz w:val="28"/>
+                <w:szCs w:val="28"/>
+              </w:rPr>
+              <w:t>role_details</w:t>
+            </w:r>
+            <w:proofErr w:type="spellEnd"/>
             <w:r>
               <w:rPr>
                 <w:b/>
@@ -9780,8 +10210,36 @@
                 <w:sz w:val="28"/>
                 <w:szCs w:val="28"/>
               </w:rPr>
-              <w:t>{{ matter.external_firms_advising[0].entity_advised</w:t>
-            </w:r>
+              <w:t xml:space="preserve">{{ </w:t>
+            </w:r>
+            <w:proofErr w:type="spellStart"/>
+            <w:r>
+              <w:rPr>
+                <w:b/>
+                <w:sz w:val="28"/>
+                <w:szCs w:val="28"/>
+              </w:rPr>
+              <w:t>matter.external_firms_advising</w:t>
+            </w:r>
+            <w:proofErr w:type="spellEnd"/>
+            <w:r>
+              <w:rPr>
+                <w:b/>
+                <w:sz w:val="28"/>
+                <w:szCs w:val="28"/>
+              </w:rPr>
+              <w:t>[0].</w:t>
+            </w:r>
+            <w:proofErr w:type="spellStart"/>
+            <w:r>
+              <w:rPr>
+                <w:b/>
+                <w:sz w:val="28"/>
+                <w:szCs w:val="28"/>
+              </w:rPr>
+              <w:t>entity_advised</w:t>
+            </w:r>
+            <w:proofErr w:type="spellEnd"/>
             <w:r>
               <w:rPr>
                 <w:b/>
@@ -9876,8 +10334,18 @@
                 <w:sz w:val="28"/>
                 <w:szCs w:val="28"/>
               </w:rPr>
-              <w:t>{{ matter.dates.start</w:t>
-            </w:r>
+              <w:t xml:space="preserve">{{ </w:t>
+            </w:r>
+            <w:proofErr w:type="spellStart"/>
+            <w:r>
+              <w:rPr>
+                <w:b/>
+                <w:sz w:val="28"/>
+                <w:szCs w:val="28"/>
+              </w:rPr>
+              <w:t>matter.dates.start</w:t>
+            </w:r>
+            <w:proofErr w:type="spellEnd"/>
             <w:r>
               <w:rPr>
                 <w:b/>
@@ -9911,8 +10379,18 @@
                 <w:sz w:val="28"/>
                 <w:szCs w:val="28"/>
               </w:rPr>
-              <w:t>{{ matter.dates.end</w:t>
-            </w:r>
+              <w:t xml:space="preserve">{{ </w:t>
+            </w:r>
+            <w:proofErr w:type="spellStart"/>
+            <w:r>
+              <w:rPr>
+                <w:b/>
+                <w:sz w:val="28"/>
+                <w:szCs w:val="28"/>
+              </w:rPr>
+              <w:t>matter.dates.end</w:t>
+            </w:r>
+            <w:proofErr w:type="spellEnd"/>
             <w:r>
               <w:rPr>
                 <w:b/>
@@ -10031,10 +10509,20 @@
       </w:r>
     </w:p>
     <w:p>
+      <w:bookmarkStart w:id="0" w:name="_GoBack"/>
       <w:r>
-        <w:t>{% endfor %}</w:t>
+        <w:t xml:space="preserve">{% </w:t>
+      </w:r>
+      <w:proofErr w:type="spellStart"/>
+      <w:r>
+        <w:t>endfor</w:t>
+      </w:r>
+      <w:proofErr w:type="spellEnd"/>
+      <w:r>
+        <w:t xml:space="preserve"> %}</w:t>
       </w:r>
     </w:p>
+    <w:bookmarkEnd w:id="0"/>
     <w:p>
       <w:pPr>
         <w:rPr>
@@ -11489,9 +11977,11 @@
     <w:rsid w:val="00587BA4"/>
     <w:rsid w:val="005A285D"/>
     <w:rsid w:val="005A3F86"/>
+    <w:rsid w:val="005A7090"/>
     <w:rsid w:val="005B2B56"/>
     <w:rsid w:val="005B3B9E"/>
     <w:rsid w:val="006655E7"/>
+    <w:rsid w:val="00690FBF"/>
     <w:rsid w:val="006C6508"/>
     <w:rsid w:val="006E6C90"/>
     <w:rsid w:val="007305E0"/>
@@ -12263,7 +12753,7 @@
 </file>
 
 <file path=customXml/itemProps1.xml><?xml version="1.0" encoding="utf-8"?>
-<ds:datastoreItem xmlns:ds="http://schemas.openxmlformats.org/officeDocument/2006/customXml" ds:itemID="{2E6CC10F-CBB5-461E-9142-52D800D940AE}">
+<ds:datastoreItem xmlns:ds="http://schemas.openxmlformats.org/officeDocument/2006/customXml" ds:itemID="{727A26AF-661A-4A52-8007-CE93BCC8F18C}">
   <ds:schemaRefs>
     <ds:schemaRef ds:uri="http://schemas.openxmlformats.org/officeDocument/2006/bibliography"/>
   </ds:schemaRefs>

</xml_diff>

<commit_message>
feat: Add EMEA submission template and update strategy for guide selection
</commit_message>
<xml_diff>
--- a/templates/legal500-us-submissions-template-2026-1-1-2.docx
+++ b/templates/legal500-us-submissions-template-2026-1-1-2.docx
@@ -2487,7 +2487,7 @@
               </wp:anchor>
             </w:drawing>
           </mc:Choice>
-          <mc:Fallback xmlns:w16sdtfl="http://schemas.microsoft.com/office/word/2024/wordml/sdtformatlock" xmlns:w16sdtdh="http://schemas.microsoft.com/office/word/2020/wordml/sdtdatahash" xmlns:w16du="http://schemas.microsoft.com/office/word/2023/wordml/word16du" xmlns:w16="http://schemas.microsoft.com/office/word/2018/wordml" xmlns:w16cid="http://schemas.microsoft.com/office/word/2016/wordml/cid" xmlns:w16cex="http://schemas.microsoft.com/office/word/2018/wordml/cex" xmlns:oel="http://schemas.microsoft.com/office/2019/extlst" xmlns:am3d="http://schemas.microsoft.com/office/drawing/2017/model3d" xmlns:aink="http://schemas.microsoft.com/office/drawing/2016/ink" xmlns:cx8="http://schemas.microsoft.com/office/drawing/2016/5/14/chartex" xmlns:cx7="http://schemas.microsoft.com/office/drawing/2016/5/13/chartex" xmlns:cx6="http://schemas.microsoft.com/office/drawing/2016/5/12/chartex" xmlns:cx5="http://schemas.microsoft.com/office/drawing/2016/5/11/chartex" xmlns:cx4="http://schemas.microsoft.com/office/drawing/2016/5/10/chartex" xmlns:cx3="http://schemas.microsoft.com/office/drawing/2016/5/9/chartex" xmlns:cx2="http://schemas.microsoft.com/office/drawing/2015/10/21/chartex" xmlns:cx1="http://schemas.microsoft.com/office/drawing/2015/9/8/chartex">
+          <mc:Fallback xmlns:cx1="http://schemas.microsoft.com/office/drawing/2015/9/8/chartex" xmlns:cx2="http://schemas.microsoft.com/office/drawing/2015/10/21/chartex" xmlns:cx3="http://schemas.microsoft.com/office/drawing/2016/5/9/chartex" xmlns:cx4="http://schemas.microsoft.com/office/drawing/2016/5/10/chartex" xmlns:cx5="http://schemas.microsoft.com/office/drawing/2016/5/11/chartex" xmlns:cx6="http://schemas.microsoft.com/office/drawing/2016/5/12/chartex" xmlns:cx7="http://schemas.microsoft.com/office/drawing/2016/5/13/chartex" xmlns:cx8="http://schemas.microsoft.com/office/drawing/2016/5/14/chartex" xmlns:aink="http://schemas.microsoft.com/office/drawing/2016/ink" xmlns:am3d="http://schemas.microsoft.com/office/drawing/2017/model3d" xmlns:oel="http://schemas.microsoft.com/office/2019/extlst" xmlns:w16cex="http://schemas.microsoft.com/office/word/2018/wordml/cex" xmlns:w16cid="http://schemas.microsoft.com/office/word/2016/wordml/cid" xmlns:w16="http://schemas.microsoft.com/office/word/2018/wordml" xmlns:w16du="http://schemas.microsoft.com/office/word/2023/wordml/word16du" xmlns:w16sdtdh="http://schemas.microsoft.com/office/word/2020/wordml/sdtdatahash" xmlns:w16sdtfl="http://schemas.microsoft.com/office/word/2024/wordml/sdtformatlock">
             <w:pict>
               <v:shape w14:anchorId="6FE7FF6C" id="Diagonal Stripe 10" o:spid="_x0000_s1026" style="position:absolute;margin-left:340.05pt;margin-top:-70.55pt;width:391.25pt;height:321.8pt;flip:x;z-index:251660288;visibility:visible;mso-wrap-style:square;mso-width-percent:0;mso-height-percent:0;mso-wrap-distance-left:9pt;mso-wrap-distance-top:0;mso-wrap-distance-right:9pt;mso-wrap-distance-bottom:0;mso-position-horizontal:right;mso-position-horizontal-relative:page;mso-position-vertical:absolute;mso-position-vertical-relative:text;mso-width-percent:0;mso-height-percent:0;mso-width-relative:margin;mso-height-relative:margin;v-text-anchor:middle" coordsize="4968737,4086971" o:gfxdata="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" path="m,2043486l2484369,,4968737,,,4086971,,2043486xe" fillcolor="red" strokecolor="black [3213]" strokeweight="3.75pt">
                 <v:stroke joinstyle="miter"/>
@@ -5617,15 +5617,6 @@
     <w:p>
       <w:pPr>
         <w:rPr>
-          <w:b/>
-          <w:sz w:val="28"/>
-          <w:szCs w:val="28"/>
-        </w:rPr>
-      </w:pPr>
-    </w:p>
-    <w:p>
-      <w:pPr>
-        <w:rPr>
           <w:sz w:val="20"/>
           <w:szCs w:val="20"/>
         </w:rPr>
@@ -5856,7 +5847,7 @@
       <w:tr>
         <w:trPr>
           <w:cantSplit/>
-          <w:trHeight w:val="2757"/>
+          <w:trHeight w:val="2990"/>
         </w:trPr>
         <w:tc>
           <w:tcPr>
@@ -6135,7 +6126,7 @@
       </w:tr>
       <w:tr>
         <w:trPr>
-          <w:trHeight w:val="2717"/>
+          <w:trHeight w:val="2869"/>
         </w:trPr>
         <w:tc>
           <w:tcPr>
@@ -11964,6 +11955,7 @@
     <w:rsidRoot w:val="00900A9C"/>
     <w:rsid w:val="000B76D4"/>
     <w:rsid w:val="000C06EE"/>
+    <w:rsid w:val="000C53A1"/>
     <w:rsid w:val="00104D60"/>
     <w:rsid w:val="00164713"/>
     <w:rsid w:val="001C155C"/>
@@ -12753,7 +12745,7 @@
 </file>
 
 <file path=customXml/itemProps1.xml><?xml version="1.0" encoding="utf-8"?>
-<ds:datastoreItem xmlns:ds="http://schemas.openxmlformats.org/officeDocument/2006/customXml" ds:itemID="{727A26AF-661A-4A52-8007-CE93BCC8F18C}">
+<ds:datastoreItem xmlns:ds="http://schemas.openxmlformats.org/officeDocument/2006/customXml" ds:itemID="{EFBBF60F-3FF0-4106-9782-8D0D5B91533B}">
   <ds:schemaRefs>
     <ds:schemaRef ds:uri="http://schemas.openxmlformats.org/officeDocument/2006/bibliography"/>
   </ds:schemaRefs>

</xml_diff>